<commit_message>
actualizacion de word con nueva antena
</commit_message>
<xml_diff>
--- a/Planificacion/Words/G1_PLANIFICACIÓN_ SEGUIMIENTO_CALIDAD.docx
+++ b/Planificacion/Words/G1_PLANIFICACIÓN_ SEGUIMIENTO_CALIDAD.docx
@@ -1432,10 +1432,17 @@
             <w:pPr>
               <w:pStyle w:val="TableParagraph"/>
               <w:ind w:left="0"/>
+              <w:jc w:val="center"/>
               <w:rPr>
                 <w:rFonts w:ascii="Times New Roman"/>
               </w:rPr>
             </w:pPr>
+            <w:r>
+              <w:rPr>
+                <w:rFonts w:ascii="Times New Roman"/>
+              </w:rPr>
+              <w:t>2,5</w:t>
+            </w:r>
           </w:p>
         </w:tc>
       </w:tr>
@@ -1688,7 +1695,15 @@
               <w:t xml:space="preserve"> </w:t>
             </w:r>
             <w:r>
-              <w:t>(gerber)</w:t>
+              <w:t>(</w:t>
+            </w:r>
+            <w:proofErr w:type="spellStart"/>
+            <w:r>
+              <w:t>gerber</w:t>
+            </w:r>
+            <w:proofErr w:type="spellEnd"/>
+            <w:r>
+              <w:t>)</w:t>
             </w:r>
           </w:p>
         </w:tc>
@@ -1954,7 +1969,15 @@
               <w:t xml:space="preserve"> </w:t>
             </w:r>
             <w:r>
-              <w:t>(gerber)</w:t>
+              <w:t>(</w:t>
+            </w:r>
+            <w:proofErr w:type="spellStart"/>
+            <w:r>
+              <w:t>gerber</w:t>
+            </w:r>
+            <w:proofErr w:type="spellEnd"/>
+            <w:r>
+              <w:t>)</w:t>
             </w:r>
           </w:p>
         </w:tc>
@@ -2446,7 +2469,23 @@
                 <w:rFonts w:ascii="Arial" w:hAnsi="Arial"/>
                 <w:b/>
               </w:rPr>
-              <w:t>(uC/FPGA).</w:t>
+              <w:t>(</w:t>
+            </w:r>
+            <w:proofErr w:type="spellStart"/>
+            <w:r>
+              <w:rPr>
+                <w:rFonts w:ascii="Arial" w:hAnsi="Arial"/>
+                <w:b/>
+              </w:rPr>
+              <w:t>uC</w:t>
+            </w:r>
+            <w:proofErr w:type="spellEnd"/>
+            <w:r>
+              <w:rPr>
+                <w:rFonts w:ascii="Arial" w:hAnsi="Arial"/>
+                <w:b/>
+              </w:rPr>
+              <w:t>/FPGA).</w:t>
             </w:r>
             <w:r>
               <w:rPr>
@@ -2679,7 +2718,23 @@
                 <w:rFonts w:ascii="Arial" w:hAnsi="Arial"/>
                 <w:b/>
               </w:rPr>
-              <w:t>(uC/FPGA).</w:t>
+              <w:t>(</w:t>
+            </w:r>
+            <w:proofErr w:type="spellStart"/>
+            <w:r>
+              <w:rPr>
+                <w:rFonts w:ascii="Arial" w:hAnsi="Arial"/>
+                <w:b/>
+              </w:rPr>
+              <w:t>uC</w:t>
+            </w:r>
+            <w:proofErr w:type="spellEnd"/>
+            <w:r>
+              <w:rPr>
+                <w:rFonts w:ascii="Arial" w:hAnsi="Arial"/>
+                <w:b/>
+              </w:rPr>
+              <w:t>/FPGA).</w:t>
             </w:r>
             <w:r>
               <w:rPr>
@@ -3898,8 +3953,13 @@
         </w:rPr>
         <w:t xml:space="preserve"> </w:t>
       </w:r>
-      <w:r>
-        <w:t>proteus,</w:t>
+      <w:proofErr w:type="spellStart"/>
+      <w:r>
+        <w:t>proteus</w:t>
+      </w:r>
+      <w:proofErr w:type="spellEnd"/>
+      <w:r>
+        <w:t>,</w:t>
       </w:r>
       <w:r>
         <w:rPr>
@@ -4016,7 +4076,23 @@
         <w:t xml:space="preserve"> </w:t>
       </w:r>
       <w:r>
-        <w:t>de las PBC’s y Victor y Clara terminaron el diagrama Gantt (1h). El miércoles por la tarde Miguel dedicó tiempo extra en la realización de los esquemáticos del PCB2 (2h). En la clase del viernes continuamos con el</w:t>
+        <w:t xml:space="preserve">de las </w:t>
+      </w:r>
+      <w:proofErr w:type="spellStart"/>
+      <w:r>
+        <w:t>PBC’s</w:t>
+      </w:r>
+      <w:proofErr w:type="spellEnd"/>
+      <w:r>
+        <w:t xml:space="preserve"> y </w:t>
+      </w:r>
+      <w:proofErr w:type="spellStart"/>
+      <w:r>
+        <w:t>Victor</w:t>
+      </w:r>
+      <w:proofErr w:type="spellEnd"/>
+      <w:r>
+        <w:t xml:space="preserve"> y Clara terminaron el diagrama Gantt (1h). El miércoles por la tarde Miguel dedicó tiempo extra en la realización de los esquemáticos del PCB2 (2h). En la clase del viernes continuamos con el</w:t>
       </w:r>
       <w:r>
         <w:rPr>
@@ -4025,7 +4101,23 @@
         <w:t xml:space="preserve"> </w:t>
       </w:r>
       <w:r>
-        <w:t>desarrollo de los diseños de los esquemáticos de las PBC’s (2.5h). En esta sesión se finalizaron los esquemáticos de las PCB1, PCB2 y PCB3, desarrollados por Mario, Miguel y Victor respectivamente. Clara comenzó el desarrollo de los esquemáticos correspondientes al PBC0.</w:t>
+        <w:t xml:space="preserve">desarrollo de los diseños de los esquemáticos de las </w:t>
+      </w:r>
+      <w:proofErr w:type="spellStart"/>
+      <w:r>
+        <w:t>PBC’s</w:t>
+      </w:r>
+      <w:proofErr w:type="spellEnd"/>
+      <w:r>
+        <w:t xml:space="preserve"> (2.5h). En esta sesión se finalizaron los esquemáticos de las PCB1, PCB2 y PCB3, desarrollados por Mario, Miguel y </w:t>
+      </w:r>
+      <w:proofErr w:type="spellStart"/>
+      <w:r>
+        <w:t>Victor</w:t>
+      </w:r>
+      <w:proofErr w:type="spellEnd"/>
+      <w:r>
+        <w:t xml:space="preserve"> respectivamente. Clara comenzó el desarrollo de los esquemáticos correspondientes al PBC0.</w:t>
       </w:r>
     </w:p>
     <w:p>
@@ -5061,8 +5153,18 @@
           <w:spacing w:val="13"/>
           <w:sz w:val="28"/>
         </w:rPr>
-        <w:t xml:space="preserve"> Cálculo de costes y diseño de las PCBs</w:t>
-      </w:r>
+        <w:t xml:space="preserve"> Cálculo de costes y diseño de las </w:t>
+      </w:r>
+      <w:proofErr w:type="spellStart"/>
+      <w:r>
+        <w:rPr>
+          <w:color w:val="585858"/>
+          <w:spacing w:val="13"/>
+          <w:sz w:val="28"/>
+        </w:rPr>
+        <w:t>PCBs</w:t>
+      </w:r>
+      <w:proofErr w:type="spellEnd"/>
       <w:r>
         <w:rPr>
           <w:color w:val="585858"/>
@@ -5078,13 +5180,29 @@
         <w:jc w:val="both"/>
       </w:pPr>
       <w:r>
-        <w:t xml:space="preserve">En la sesión del martes se han realizado labores de actualización y refinado de los esquemáticos. Mario y Miguel comenzaron con la especificación de las PCBs mientras que Víctor y Clara se encargaban de comenzar con las hojas de coste y actualización </w:t>
+        <w:t xml:space="preserve">En la sesión del martes se han realizado labores de actualización y refinado de los esquemáticos. Mario y Miguel comenzaron con la especificación de las </w:t>
+      </w:r>
+      <w:proofErr w:type="spellStart"/>
+      <w:r>
+        <w:t>PCBs</w:t>
+      </w:r>
+      <w:proofErr w:type="spellEnd"/>
+      <w:r>
+        <w:t xml:space="preserve"> mientras que Víctor y Clara se encargaban de comenzar con las hojas de coste y actualización </w:t>
       </w:r>
       <w:r>
         <w:t>de los diagramas</w:t>
       </w:r>
       <w:r>
-        <w:t xml:space="preserve"> Gant(1h). Clara dedico tiempo el jueves por la tarde para crear el logo y pensar en un nombre para nuestro </w:t>
+        <w:t xml:space="preserve"> </w:t>
+      </w:r>
+      <w:proofErr w:type="spellStart"/>
+      <w:r>
+        <w:t>Gant</w:t>
+      </w:r>
+      <w:proofErr w:type="spellEnd"/>
+      <w:r>
+        <w:t xml:space="preserve">(1h). Clara dedico tiempo el jueves por la tarde para crear el logo y pensar en un nombre para nuestro </w:t>
       </w:r>
       <w:r>
         <w:t>grupo (</w:t>
@@ -5100,7 +5218,15 @@
       </w:pPr>
       <w:r>
         <w:br/>
-        <w:t xml:space="preserve">En la sesión del viernes se continuo con las labores empezadas el martes dejando prácticamente acabadas las PCBs(dos de ellas no se van a poder mostrar por problemas para poder acceder a ellas al no haberse guardado </w:t>
+        <w:t xml:space="preserve">En la sesión del viernes se continuo con las labores empezadas el martes dejando prácticamente acabadas las </w:t>
+      </w:r>
+      <w:proofErr w:type="spellStart"/>
+      <w:r>
+        <w:t>PCBs</w:t>
+      </w:r>
+      <w:proofErr w:type="spellEnd"/>
+      <w:r>
+        <w:t xml:space="preserve">(dos de ellas no se van a poder mostrar por problemas para poder acceder a ellas al no haberse guardado </w:t>
       </w:r>
       <w:r>
         <w:t>correctamente) (</w:t>
@@ -5121,8 +5247,13 @@
         <w:jc w:val="both"/>
       </w:pPr>
       <w:r>
-        <w:t>Los esquemáticos se van a guardar en el Anexo 1 para así aligerar el peso de este archivo, y lo mismo se va a hacer con las PCBs</w:t>
-      </w:r>
+        <w:t xml:space="preserve">Los esquemáticos se van a guardar en el Anexo 1 para así aligerar el peso de este archivo, y lo mismo se va a hacer con las </w:t>
+      </w:r>
+      <w:proofErr w:type="spellStart"/>
+      <w:r>
+        <w:t>PCBs</w:t>
+      </w:r>
+      <w:proofErr w:type="spellEnd"/>
       <w:r>
         <w:t xml:space="preserve"> en el Anexo 2</w:t>
       </w:r>
@@ -5145,13 +5276,19 @@
         <w:jc w:val="both"/>
       </w:pPr>
       <w:r>
-        <w:t xml:space="preserve">Durante el fin de semana Victor estuvo </w:t>
+        <w:t xml:space="preserve">Durante el fin de semana </w:t>
+      </w:r>
+      <w:r>
+        <w:t>Víctor</w:t>
+      </w:r>
+      <w:r>
+        <w:t xml:space="preserve"> estuvo </w:t>
       </w:r>
       <w:r>
         <w:t>corrigiendo algunos de los comentarios del profesor durante la sesión. En concreto lo relativo a los ficheros BOM</w:t>
       </w:r>
       <w:r>
-        <w:t xml:space="preserve"> ( que se encuentra en la carpeta BOM)</w:t>
+        <w:t xml:space="preserve"> (que se encuentra en la carpeta BOM)</w:t>
       </w:r>
       <w:r>
         <w:t>,</w:t>
@@ -5167,6 +5304,213 @@
       </w:r>
       <w:r>
         <w:t>h).</w:t>
+      </w:r>
+    </w:p>
+    <w:p>
+      <w:pPr>
+        <w:ind w:left="47" w:right="135"/>
+        <w:jc w:val="both"/>
+        <w:rPr>
+          <w:noProof/>
+        </w:rPr>
+      </w:pPr>
+    </w:p>
+    <w:p>
+      <w:pPr>
+        <w:ind w:left="47" w:right="135"/>
+        <w:jc w:val="both"/>
+        <w:rPr>
+          <w:noProof/>
+        </w:rPr>
+      </w:pPr>
+    </w:p>
+    <w:p>
+      <w:pPr>
+        <w:ind w:left="47" w:right="135"/>
+        <w:jc w:val="both"/>
+      </w:pPr>
+      <w:r>
+        <w:rPr>
+          <w:noProof/>
+        </w:rPr>
+        <w:lastRenderedPageBreak/>
+        <w:drawing>
+          <wp:inline distT="0" distB="0" distL="0" distR="0" wp14:anchorId="3FF300C1" wp14:editId="12157AE3">
+            <wp:extent cx="5493385" cy="6887688"/>
+            <wp:effectExtent l="0" t="0" r="0" b="8890"/>
+            <wp:docPr id="1368986028" name="Imagen 3"/>
+            <wp:cNvGraphicFramePr>
+              <a:graphicFrameLocks xmlns:a="http://schemas.openxmlformats.org/drawingml/2006/main" noChangeAspect="1"/>
+            </wp:cNvGraphicFramePr>
+            <a:graphic xmlns:a="http://schemas.openxmlformats.org/drawingml/2006/main">
+              <a:graphicData uri="http://schemas.openxmlformats.org/drawingml/2006/picture">
+                <pic:pic xmlns:pic="http://schemas.openxmlformats.org/drawingml/2006/picture">
+                  <pic:nvPicPr>
+                    <pic:cNvPr id="1368986028" name="Imagen 1368986028"/>
+                    <pic:cNvPicPr/>
+                  </pic:nvPicPr>
+                  <pic:blipFill rotWithShape="1">
+                    <a:blip r:embed="rId15"/>
+                    <a:srcRect b="11340"/>
+                    <a:stretch>
+                      <a:fillRect/>
+                    </a:stretch>
+                  </pic:blipFill>
+                  <pic:spPr bwMode="auto">
+                    <a:xfrm>
+                      <a:off x="0" y="0"/>
+                      <a:ext cx="5493385" cy="6887688"/>
+                    </a:xfrm>
+                    <a:prstGeom prst="rect">
+                      <a:avLst/>
+                    </a:prstGeom>
+                    <a:ln>
+                      <a:noFill/>
+                    </a:ln>
+                    <a:extLst>
+                      <a:ext uri="{53640926-AAD7-44D8-BBD7-CCE9431645EC}">
+                        <a14:shadowObscured xmlns:a14="http://schemas.microsoft.com/office/drawing/2010/main"/>
+                      </a:ext>
+                    </a:extLst>
+                  </pic:spPr>
+                </pic:pic>
+              </a:graphicData>
+            </a:graphic>
+          </wp:inline>
+        </w:drawing>
+      </w:r>
+    </w:p>
+    <w:p>
+      <w:pPr>
+        <w:spacing w:before="156"/>
+        <w:ind w:left="2"/>
+        <w:rPr>
+          <w:sz w:val="28"/>
+        </w:rPr>
+      </w:pPr>
+      <w:r>
+        <w:rPr>
+          <w:color w:val="585858"/>
+          <w:spacing w:val="11"/>
+          <w:sz w:val="28"/>
+        </w:rPr>
+        <w:t>Semana</w:t>
+      </w:r>
+      <w:r>
+        <w:rPr>
+          <w:color w:val="585858"/>
+          <w:spacing w:val="35"/>
+          <w:sz w:val="28"/>
+        </w:rPr>
+        <w:t xml:space="preserve"> </w:t>
+      </w:r>
+      <w:r>
+        <w:rPr>
+          <w:color w:val="585858"/>
+          <w:spacing w:val="14"/>
+          <w:sz w:val="28"/>
+        </w:rPr>
+        <w:t>06</w:t>
+      </w:r>
+      <w:r>
+        <w:rPr>
+          <w:color w:val="585858"/>
+          <w:spacing w:val="14"/>
+          <w:sz w:val="28"/>
+        </w:rPr>
+        <w:t>/9-</w:t>
+      </w:r>
+      <w:r>
+        <w:rPr>
+          <w:color w:val="585858"/>
+          <w:spacing w:val="7"/>
+          <w:sz w:val="28"/>
+        </w:rPr>
+        <w:t>12</w:t>
+      </w:r>
+      <w:r>
+        <w:rPr>
+          <w:color w:val="585858"/>
+          <w:spacing w:val="7"/>
+          <w:sz w:val="28"/>
+        </w:rPr>
+        <w:t>/10</w:t>
+      </w:r>
+    </w:p>
+    <w:p>
+      <w:pPr>
+        <w:ind w:left="47" w:right="135"/>
+        <w:jc w:val="both"/>
+        <w:rPr>
+          <w:color w:val="585858"/>
+          <w:spacing w:val="13"/>
+          <w:sz w:val="28"/>
+        </w:rPr>
+      </w:pPr>
+      <w:r>
+        <w:rPr>
+          <w:color w:val="585858"/>
+          <w:spacing w:val="13"/>
+          <w:sz w:val="28"/>
+        </w:rPr>
+        <w:t>(Planificación:</w:t>
+      </w:r>
+      <w:r>
+        <w:rPr>
+          <w:color w:val="585858"/>
+          <w:spacing w:val="13"/>
+          <w:sz w:val="28"/>
+        </w:rPr>
+        <w:t xml:space="preserve"> análisis del consumo eléctrico)</w:t>
+      </w:r>
+    </w:p>
+    <w:p>
+      <w:pPr>
+        <w:ind w:left="47" w:right="135"/>
+        <w:jc w:val="both"/>
+        <w:rPr>
+          <w:color w:val="585858"/>
+          <w:spacing w:val="13"/>
+          <w:sz w:val="28"/>
+        </w:rPr>
+      </w:pPr>
+    </w:p>
+    <w:p>
+      <w:r>
+        <w:t xml:space="preserve">El lunes tuvimos de nuevo una sesión de laboratorio, donde se enseño como crear las huellas de los componentes y analizar el consumo eléctrico (1H). </w:t>
+      </w:r>
+      <w:r>
+        <w:t>Además</w:t>
+      </w:r>
+      <w:r>
+        <w:t xml:space="preserve"> continuamos </w:t>
+      </w:r>
+      <w:r>
+        <w:t>realizando</w:t>
+      </w:r>
+      <w:r>
+        <w:t xml:space="preserve"> las huellas que se nos habían extraviado, actualizando el diagrama de Gantt y terminando con las Bill of Material (1H). </w:t>
+      </w:r>
+    </w:p>
+    <w:p/>
+    <w:p>
+      <w:r>
+        <w:t>Víctor</w:t>
+      </w:r>
+      <w:r>
+        <w:t xml:space="preserve"> actualizó el </w:t>
+      </w:r>
+      <w:r>
+        <w:t>esquemático</w:t>
+      </w:r>
+      <w:r>
+        <w:t xml:space="preserve"> de la PCB3 debido a que íbamos a implementar una nueva antena con posibilidad de adaptación de impedancias con una red en forma de PI. </w:t>
+      </w:r>
+      <w:r>
+        <w:t>Además,</w:t>
+      </w:r>
+      <w:r>
+        <w:t xml:space="preserve"> actualizó el BOM de la PCB3 con los nuevos componentes (0,5H)</w:t>
       </w:r>
     </w:p>
     <w:sectPr>
@@ -6024,7 +6368,7 @@
   <w:style w:type="paragraph" w:default="1" w:styleId="Normal">
     <w:name w:val="Normal"/>
     <w:qFormat/>
-    <w:rsid w:val="007E21C4"/>
+    <w:rsid w:val="00A90DF6"/>
     <w:rPr>
       <w:rFonts w:ascii="Arial MT" w:eastAsia="Arial MT" w:hAnsi="Arial MT" w:cs="Arial MT"/>
       <w:lang w:val="es-ES"/>

</xml_diff>

<commit_message>
actualizado word de planificacion
</commit_message>
<xml_diff>
--- a/Planificacion/Words/G1_PLANIFICACIÓN_ SEGUIMIENTO_CALIDAD.docx
+++ b/Planificacion/Words/G1_PLANIFICACIÓN_ SEGUIMIENTO_CALIDAD.docx
@@ -1,10 +1,10 @@
 
 <file path=word/document.xml><?xml version="1.0" encoding="utf-8"?>
-<w:document xmlns:wpc="http://schemas.microsoft.com/office/word/2010/wordprocessingCanvas" xmlns:cx="http://schemas.microsoft.com/office/drawing/2014/chartex" xmlns:cx1="http://schemas.microsoft.com/office/drawing/2015/9/8/chartex" xmlns:cx2="http://schemas.microsoft.com/office/drawing/2015/10/21/chartex" xmlns:cx3="http://schemas.microsoft.com/office/drawing/2016/5/9/chartex" xmlns:cx4="http://schemas.microsoft.com/office/drawing/2016/5/10/chartex" xmlns:cx5="http://schemas.microsoft.com/office/drawing/2016/5/11/chartex" xmlns:cx6="http://schemas.microsoft.com/office/drawing/2016/5/12/chartex" xmlns:cx7="http://schemas.microsoft.com/office/drawing/2016/5/13/chartex" xmlns:cx8="http://schemas.microsoft.com/office/drawing/2016/5/14/chartex" xmlns:mc="http://schemas.openxmlformats.org/markup-compatibility/2006" xmlns:aink="http://schemas.microsoft.com/office/drawing/2016/ink" xmlns:am3d="http://schemas.microsoft.com/office/drawing/2017/model3d" xmlns:o="urn:schemas-microsoft-com:office:office" xmlns:oel="http://schemas.microsoft.com/office/2019/extlst" xmlns:r="http://schemas.openxmlformats.org/officeDocument/2006/relationships" xmlns:m="http://schemas.openxmlformats.org/officeDocument/2006/math" xmlns:v="urn:schemas-microsoft-com:vml" xmlns:wp14="http://schemas.microsoft.com/office/word/2010/wordprocessingDrawing" xmlns:wp="http://schemas.openxmlformats.org/drawingml/2006/wordprocessingDrawing" xmlns:w10="urn:schemas-microsoft-com:office:word" xmlns:w="http://schemas.openxmlformats.org/wordprocessingml/2006/main" xmlns:w14="http://schemas.microsoft.com/office/word/2010/wordml" xmlns:w15="http://schemas.microsoft.com/office/word/2012/wordml" xmlns:w16cex="http://schemas.microsoft.com/office/word/2018/wordml/cex" xmlns:w16cid="http://schemas.microsoft.com/office/word/2016/wordml/cid" xmlns:w16="http://schemas.microsoft.com/office/word/2018/wordml" xmlns:w16du="http://schemas.microsoft.com/office/word/2023/wordml/word16du" xmlns:w16sdtdh="http://schemas.microsoft.com/office/word/2020/wordml/sdtdatahash" xmlns:w16sdtfl="http://schemas.microsoft.com/office/word/2024/wordml/sdtformatlock" xmlns:w16se="http://schemas.microsoft.com/office/word/2015/wordml/symex" xmlns:wpg="http://schemas.microsoft.com/office/word/2010/wordprocessingGroup" xmlns:wpi="http://schemas.microsoft.com/office/word/2010/wordprocessingInk" xmlns:wne="http://schemas.microsoft.com/office/word/2006/wordml" xmlns:wps="http://schemas.microsoft.com/office/word/2010/wordprocessingShape" mc:Ignorable="w14 w15 w16se w16cid w16 w16cex w16sdtdh w16sdtfl w16du wp14">
+<w:document xmlns:wpc="http://schemas.microsoft.com/office/word/2010/wordprocessingCanvas" xmlns:mc="http://schemas.openxmlformats.org/markup-compatibility/2006" xmlns:o="urn:schemas-microsoft-com:office:office" xmlns:r="http://schemas.openxmlformats.org/officeDocument/2006/relationships" xmlns:m="http://schemas.openxmlformats.org/officeDocument/2006/math" xmlns:v="urn:schemas-microsoft-com:vml" xmlns:wp14="http://schemas.microsoft.com/office/word/2010/wordprocessingDrawing" xmlns:wp="http://schemas.openxmlformats.org/drawingml/2006/wordprocessingDrawing" xmlns:w10="urn:schemas-microsoft-com:office:word" xmlns:w="http://schemas.openxmlformats.org/wordprocessingml/2006/main" xmlns:w14="http://schemas.microsoft.com/office/word/2010/wordml" xmlns:w15="http://schemas.microsoft.com/office/word/2012/wordml" xmlns:wpg="http://schemas.microsoft.com/office/word/2010/wordprocessingGroup" xmlns:wpi="http://schemas.microsoft.com/office/word/2010/wordprocessingInk" xmlns:wne="http://schemas.microsoft.com/office/word/2006/wordml" xmlns:wps="http://schemas.microsoft.com/office/word/2010/wordprocessingShape" mc:Ignorable="w14 w15 wp14">
   <w:body>
     <w:p>
       <w:pPr>
-        <w:pStyle w:val="Ttulo"/>
+        <w:pStyle w:val="Puesto"/>
       </w:pPr>
       <w:r>
         <w:t>Plan</w:t>
@@ -122,6 +122,7 @@
           <w:b/>
           <w:noProof/>
           <w:sz w:val="20"/>
+          <w:lang w:eastAsia="es-ES"/>
         </w:rPr>
         <w:drawing>
           <wp:anchor distT="0" distB="0" distL="0" distR="0" simplePos="0" relativeHeight="487587840" behindDoc="1" locked="0" layoutInCell="1" allowOverlap="1" wp14:anchorId="6363D3E0" wp14:editId="6363D3E1">
@@ -1441,7 +1442,13 @@
               <w:rPr>
                 <w:rFonts w:ascii="Times New Roman"/>
               </w:rPr>
-              <w:t>2,5</w:t>
+              <w:t>4</w:t>
+            </w:r>
+            <w:r>
+              <w:rPr>
+                <w:rFonts w:ascii="Times New Roman"/>
+              </w:rPr>
+              <w:t>,5</w:t>
             </w:r>
           </w:p>
         </w:tc>
@@ -4047,6 +4054,7 @@
         <w:rPr>
           <w:noProof/>
           <w:sz w:val="11"/>
+          <w:lang w:eastAsia="es-ES"/>
         </w:rPr>
         <w:drawing>
           <wp:anchor distT="0" distB="0" distL="0" distR="0" simplePos="0" relativeHeight="487588352" behindDoc="1" locked="0" layoutInCell="1" allowOverlap="1" wp14:anchorId="6363D3E2" wp14:editId="6363D3E3">
@@ -4220,6 +4228,7 @@
         <w:rPr>
           <w:noProof/>
           <w:sz w:val="20"/>
+          <w:lang w:eastAsia="es-ES"/>
         </w:rPr>
         <w:drawing>
           <wp:inline distT="0" distB="0" distL="0" distR="0" wp14:anchorId="6363D3E4" wp14:editId="6363D3E5">
@@ -4364,6 +4373,7 @@
         <w:rPr>
           <w:noProof/>
           <w:sz w:val="13"/>
+          <w:lang w:eastAsia="es-ES"/>
         </w:rPr>
         <w:drawing>
           <wp:anchor distT="0" distB="0" distL="0" distR="0" simplePos="0" relativeHeight="487588864" behindDoc="1" locked="0" layoutInCell="1" allowOverlap="1" wp14:anchorId="6363D3E6" wp14:editId="6363D3E7">
@@ -4545,6 +4555,7 @@
         <w:rPr>
           <w:noProof/>
           <w:sz w:val="20"/>
+          <w:lang w:eastAsia="es-ES"/>
         </w:rPr>
         <w:drawing>
           <wp:inline distT="0" distB="0" distL="0" distR="0" wp14:anchorId="6363D3E8" wp14:editId="6363D3E9">
@@ -4689,6 +4700,7 @@
         <w:rPr>
           <w:noProof/>
           <w:sz w:val="13"/>
+          <w:lang w:eastAsia="es-ES"/>
         </w:rPr>
         <w:drawing>
           <wp:anchor distT="0" distB="0" distL="0" distR="0" simplePos="0" relativeHeight="487589376" behindDoc="1" locked="0" layoutInCell="1" allowOverlap="1" wp14:anchorId="6363D3EA" wp14:editId="6363D3EB">
@@ -4862,6 +4874,7 @@
         <w:rPr>
           <w:noProof/>
           <w:sz w:val="20"/>
+          <w:lang w:eastAsia="es-ES"/>
         </w:rPr>
         <w:drawing>
           <wp:inline distT="0" distB="0" distL="0" distR="0" wp14:anchorId="6363D3EC" wp14:editId="6363D3ED">
@@ -5208,6 +5221,7 @@
       <w:r>
         <w:rPr>
           <w:noProof/>
+          <w:lang w:eastAsia="es-ES"/>
         </w:rPr>
         <w:lastRenderedPageBreak/>
         <w:drawing>
@@ -5328,8 +5342,17 @@
       </w:pPr>
     </w:p>
     <w:p>
-      <w:r>
-        <w:t xml:space="preserve">El lunes tuvimos de nuevo una sesión de laboratorio, donde se enseño como crear las huellas de los componentes y analizar el consumo eléctrico (1H). </w:t>
+      <w:pPr>
+        <w:jc w:val="both"/>
+      </w:pPr>
+      <w:r>
+        <w:t xml:space="preserve">El lunes tuvimos de nuevo una sesión de laboratorio, donde se </w:t>
+      </w:r>
+      <w:r>
+        <w:t>enseñó</w:t>
+      </w:r>
+      <w:r>
+        <w:t xml:space="preserve"> como crear las huellas de los componentes y analizar el consumo eléctrico (1H). </w:t>
       </w:r>
       <w:r>
         <w:t>Además</w:t>
@@ -5344,39 +5367,152 @@
         <w:t>realizando</w:t>
       </w:r>
       <w:r>
-        <w:t xml:space="preserve"> las huellas que se nos habían extraviado, actualizando el diagrama de Gantt y terminando con las Bill of Material (1H). </w:t>
+        <w:t xml:space="preserve"> las huellas que se nos habían extraviado, actualizando el diagrama de Gantt y terminando con </w:t>
+      </w:r>
+      <w:r>
+        <w:t>el Bill of Material (1 H</w:t>
+      </w:r>
+      <w:r>
+        <w:t xml:space="preserve">). </w:t>
+      </w:r>
+    </w:p>
+    <w:p>
+      <w:pPr>
+        <w:jc w:val="both"/>
+      </w:pPr>
+    </w:p>
+    <w:p>
+      <w:pPr>
+        <w:jc w:val="both"/>
+      </w:pPr>
+      <w:r>
+        <w:t>Víctor</w:t>
+      </w:r>
+      <w:r>
+        <w:t xml:space="preserve"> actualizó el </w:t>
+      </w:r>
+      <w:r>
+        <w:t>esquemático</w:t>
+      </w:r>
+      <w:r>
+        <w:t xml:space="preserve"> de la PCB3 debido a que íbamos a implementar una nueva antena con posibilidad de adaptación de impedancias con una red en forma de PI. </w:t>
+      </w:r>
+      <w:r>
+        <w:t>Además,</w:t>
+      </w:r>
+      <w:r>
+        <w:t xml:space="preserve"> actualizó el BOM de la PCB3 con los nuevos componentes (0,5H)</w:t>
+      </w:r>
+      <w:r>
+        <w:t>.</w:t>
       </w:r>
     </w:p>
     <w:p/>
     <w:p>
-      <w:r>
-        <w:t>Víctor</w:t>
-      </w:r>
-      <w:r>
-        <w:t xml:space="preserve"> actualizó el </w:t>
-      </w:r>
-      <w:r>
-        <w:t>esquemático</w:t>
-      </w:r>
-      <w:r>
-        <w:t xml:space="preserve"> de la PCB3 debido a que íbamos a implementar una nueva antena con posibilidad de adaptación de impedancias con una red en forma de PI. </w:t>
-      </w:r>
-      <w:r>
-        <w:t>Además,</w:t>
-      </w:r>
-      <w:r>
-        <w:t xml:space="preserve"> actualizó el BOM de la PCB3 con los nuevos componentes (0,5H)</w:t>
-      </w:r>
-      <w:r>
-        <w:t>.</w:t>
-      </w:r>
-    </w:p>
-    <w:p/>
-    <w:p>
+      <w:pPr>
+        <w:jc w:val="both"/>
+      </w:pPr>
       <w:r>
         <w:lastRenderedPageBreak/>
         <w:t>El martes, Miguel y Mario continuaron con las PCBs. Se diseñaron y crearon las huellas faltantes y se finalizó el posicionamiento de todas las huellas para las cuatro placas de circuito impreso. Se diseñó la antena y se realizaron los cambios correspondientes en su esquemático. Víctor y Clara continuaron con la planificación, la documentación, el BOM y comenzaron a elaborar el análisis térmico y eléctrico.</w:t>
       </w:r>
+    </w:p>
+    <w:p>
+      <w:pPr>
+        <w:jc w:val="both"/>
+      </w:pPr>
+    </w:p>
+    <w:p>
+      <w:pPr>
+        <w:spacing w:before="156"/>
+        <w:ind w:left="2"/>
+        <w:jc w:val="both"/>
+        <w:rPr>
+          <w:sz w:val="28"/>
+        </w:rPr>
+      </w:pPr>
+      <w:r>
+        <w:rPr>
+          <w:color w:val="585858"/>
+          <w:spacing w:val="11"/>
+          <w:sz w:val="28"/>
+        </w:rPr>
+        <w:t>Semana</w:t>
+      </w:r>
+      <w:r>
+        <w:rPr>
+          <w:color w:val="585858"/>
+          <w:spacing w:val="35"/>
+          <w:sz w:val="28"/>
+        </w:rPr>
+        <w:t xml:space="preserve"> </w:t>
+      </w:r>
+      <w:r>
+        <w:rPr>
+          <w:color w:val="585858"/>
+          <w:spacing w:val="14"/>
+          <w:sz w:val="28"/>
+        </w:rPr>
+        <w:t>13/10</w:t>
+      </w:r>
+      <w:r>
+        <w:rPr>
+          <w:color w:val="585858"/>
+          <w:spacing w:val="14"/>
+          <w:sz w:val="28"/>
+        </w:rPr>
+        <w:t>-</w:t>
+      </w:r>
+      <w:r>
+        <w:rPr>
+          <w:color w:val="585858"/>
+          <w:spacing w:val="7"/>
+          <w:sz w:val="28"/>
+        </w:rPr>
+        <w:t>19</w:t>
+      </w:r>
+      <w:r>
+        <w:rPr>
+          <w:color w:val="585858"/>
+          <w:spacing w:val="7"/>
+          <w:sz w:val="28"/>
+        </w:rPr>
+        <w:t>/10</w:t>
+      </w:r>
+    </w:p>
+    <w:p>
+      <w:pPr>
+        <w:ind w:left="47" w:right="135"/>
+        <w:jc w:val="both"/>
+        <w:rPr>
+          <w:color w:val="585858"/>
+          <w:spacing w:val="13"/>
+          <w:sz w:val="28"/>
+        </w:rPr>
+      </w:pPr>
+      <w:r>
+        <w:rPr>
+          <w:color w:val="585858"/>
+          <w:spacing w:val="13"/>
+          <w:sz w:val="28"/>
+        </w:rPr>
+        <w:t>(Planificación: análisis del consumo eléctrico)</w:t>
+      </w:r>
+    </w:p>
+    <w:p>
+      <w:pPr>
+        <w:jc w:val="both"/>
+      </w:pPr>
+    </w:p>
+    <w:p>
+      <w:pPr>
+        <w:jc w:val="both"/>
+      </w:pPr>
+      <w:r>
+        <w:t>El lunes tuvimos sesión de laboratorio, donde la primera sesión estuvimos aprendiendo sobre la PCB2 de sensores, su funcionamiento general, patillaje, consumos, o señales de calibración (1h). En la segunda parte de la sesión, Mario y Miguel finalizaron con las PCB que presentaron problemas anteriormente, mientras Víctor y Clara estuvieron con el análisis eléctrico de las PCB 0 y 1, además de con la actualización de la documentación, planificación y control de cambios (1H)</w:t>
+      </w:r>
+      <w:bookmarkStart w:id="0" w:name="_GoBack"/>
+      <w:bookmarkEnd w:id="0"/>
     </w:p>
     <w:sectPr>
       <w:pgSz w:w="11910" w:h="16840"/>
@@ -5388,7 +5524,7 @@
 </file>
 
 <file path=word/endnotes.xml><?xml version="1.0" encoding="utf-8"?>
-<w:endnotes xmlns:wpc="http://schemas.microsoft.com/office/word/2010/wordprocessingCanvas" xmlns:cx="http://schemas.microsoft.com/office/drawing/2014/chartex" xmlns:cx1="http://schemas.microsoft.com/office/drawing/2015/9/8/chartex" xmlns:cx2="http://schemas.microsoft.com/office/drawing/2015/10/21/chartex" xmlns:cx3="http://schemas.microsoft.com/office/drawing/2016/5/9/chartex" xmlns:cx4="http://schemas.microsoft.com/office/drawing/2016/5/10/chartex" xmlns:cx5="http://schemas.microsoft.com/office/drawing/2016/5/11/chartex" xmlns:cx6="http://schemas.microsoft.com/office/drawing/2016/5/12/chartex" xmlns:cx7="http://schemas.microsoft.com/office/drawing/2016/5/13/chartex" xmlns:cx8="http://schemas.microsoft.com/office/drawing/2016/5/14/chartex" xmlns:mc="http://schemas.openxmlformats.org/markup-compatibility/2006" xmlns:aink="http://schemas.microsoft.com/office/drawing/2016/ink" xmlns:am3d="http://schemas.microsoft.com/office/drawing/2017/model3d" xmlns:o="urn:schemas-microsoft-com:office:office" xmlns:oel="http://schemas.microsoft.com/office/2019/extlst" xmlns:r="http://schemas.openxmlformats.org/officeDocument/2006/relationships" xmlns:m="http://schemas.openxmlformats.org/officeDocument/2006/math" xmlns:v="urn:schemas-microsoft-com:vml" xmlns:wp14="http://schemas.microsoft.com/office/word/2010/wordprocessingDrawing" xmlns:wp="http://schemas.openxmlformats.org/drawingml/2006/wordprocessingDrawing" xmlns:w10="urn:schemas-microsoft-com:office:word" xmlns:w="http://schemas.openxmlformats.org/wordprocessingml/2006/main" xmlns:w14="http://schemas.microsoft.com/office/word/2010/wordml" xmlns:w15="http://schemas.microsoft.com/office/word/2012/wordml" xmlns:w16cex="http://schemas.microsoft.com/office/word/2018/wordml/cex" xmlns:w16cid="http://schemas.microsoft.com/office/word/2016/wordml/cid" xmlns:w16="http://schemas.microsoft.com/office/word/2018/wordml" xmlns:w16du="http://schemas.microsoft.com/office/word/2023/wordml/word16du" xmlns:w16sdtdh="http://schemas.microsoft.com/office/word/2020/wordml/sdtdatahash" xmlns:w16sdtfl="http://schemas.microsoft.com/office/word/2024/wordml/sdtformatlock" xmlns:w16se="http://schemas.microsoft.com/office/word/2015/wordml/symex" xmlns:wpg="http://schemas.microsoft.com/office/word/2010/wordprocessingGroup" xmlns:wpi="http://schemas.microsoft.com/office/word/2010/wordprocessingInk" xmlns:wne="http://schemas.microsoft.com/office/word/2006/wordml" xmlns:wps="http://schemas.microsoft.com/office/word/2010/wordprocessingShape" mc:Ignorable="w14 w15 w16se w16cid w16 w16cex w16sdtdh w16sdtfl w16du wp14">
+<w:endnotes xmlns:wpc="http://schemas.microsoft.com/office/word/2010/wordprocessingCanvas" xmlns:mc="http://schemas.openxmlformats.org/markup-compatibility/2006" xmlns:o="urn:schemas-microsoft-com:office:office" xmlns:r="http://schemas.openxmlformats.org/officeDocument/2006/relationships" xmlns:m="http://schemas.openxmlformats.org/officeDocument/2006/math" xmlns:v="urn:schemas-microsoft-com:vml" xmlns:wp14="http://schemas.microsoft.com/office/word/2010/wordprocessingDrawing" xmlns:wp="http://schemas.openxmlformats.org/drawingml/2006/wordprocessingDrawing" xmlns:w10="urn:schemas-microsoft-com:office:word" xmlns:w="http://schemas.openxmlformats.org/wordprocessingml/2006/main" xmlns:w14="http://schemas.microsoft.com/office/word/2010/wordml" xmlns:w15="http://schemas.microsoft.com/office/word/2012/wordml" xmlns:wpg="http://schemas.microsoft.com/office/word/2010/wordprocessingGroup" xmlns:wpi="http://schemas.microsoft.com/office/word/2010/wordprocessingInk" xmlns:wne="http://schemas.microsoft.com/office/word/2006/wordml" xmlns:wps="http://schemas.microsoft.com/office/word/2010/wordprocessingShape" mc:Ignorable="w14 w15 wp14">
   <w:endnote w:type="separator" w:id="-1">
     <w:p>
       <w:r>
@@ -5407,7 +5543,7 @@
 </file>
 
 <file path=word/footer1.xml><?xml version="1.0" encoding="utf-8"?>
-<w:ftr xmlns:wpc="http://schemas.microsoft.com/office/word/2010/wordprocessingCanvas" xmlns:cx="http://schemas.microsoft.com/office/drawing/2014/chartex" xmlns:cx1="http://schemas.microsoft.com/office/drawing/2015/9/8/chartex" xmlns:cx2="http://schemas.microsoft.com/office/drawing/2015/10/21/chartex" xmlns:cx3="http://schemas.microsoft.com/office/drawing/2016/5/9/chartex" xmlns:cx4="http://schemas.microsoft.com/office/drawing/2016/5/10/chartex" xmlns:cx5="http://schemas.microsoft.com/office/drawing/2016/5/11/chartex" xmlns:cx6="http://schemas.microsoft.com/office/drawing/2016/5/12/chartex" xmlns:cx7="http://schemas.microsoft.com/office/drawing/2016/5/13/chartex" xmlns:cx8="http://schemas.microsoft.com/office/drawing/2016/5/14/chartex" xmlns:mc="http://schemas.openxmlformats.org/markup-compatibility/2006" xmlns:aink="http://schemas.microsoft.com/office/drawing/2016/ink" xmlns:am3d="http://schemas.microsoft.com/office/drawing/2017/model3d" xmlns:o="urn:schemas-microsoft-com:office:office" xmlns:oel="http://schemas.microsoft.com/office/2019/extlst" xmlns:r="http://schemas.openxmlformats.org/officeDocument/2006/relationships" xmlns:m="http://schemas.openxmlformats.org/officeDocument/2006/math" xmlns:v="urn:schemas-microsoft-com:vml" xmlns:wp14="http://schemas.microsoft.com/office/word/2010/wordprocessingDrawing" xmlns:wp="http://schemas.openxmlformats.org/drawingml/2006/wordprocessingDrawing" xmlns:w10="urn:schemas-microsoft-com:office:word" xmlns:w="http://schemas.openxmlformats.org/wordprocessingml/2006/main" xmlns:w14="http://schemas.microsoft.com/office/word/2010/wordml" xmlns:w15="http://schemas.microsoft.com/office/word/2012/wordml" xmlns:w16cex="http://schemas.microsoft.com/office/word/2018/wordml/cex" xmlns:w16cid="http://schemas.microsoft.com/office/word/2016/wordml/cid" xmlns:w16="http://schemas.microsoft.com/office/word/2018/wordml" xmlns:w16du="http://schemas.microsoft.com/office/word/2023/wordml/word16du" xmlns:w16sdtdh="http://schemas.microsoft.com/office/word/2020/wordml/sdtdatahash" xmlns:w16sdtfl="http://schemas.microsoft.com/office/word/2024/wordml/sdtformatlock" xmlns:w16se="http://schemas.microsoft.com/office/word/2015/wordml/symex" xmlns:wpg="http://schemas.microsoft.com/office/word/2010/wordprocessingGroup" xmlns:wpi="http://schemas.microsoft.com/office/word/2010/wordprocessingInk" xmlns:wne="http://schemas.microsoft.com/office/word/2006/wordml" xmlns:wps="http://schemas.microsoft.com/office/word/2010/wordprocessingShape" mc:Ignorable="w14 w15 w16se w16cid w16 w16cex w16sdtdh w16sdtfl w16du wp14">
+<w:ftr xmlns:wpc="http://schemas.microsoft.com/office/word/2010/wordprocessingCanvas" xmlns:mc="http://schemas.openxmlformats.org/markup-compatibility/2006" xmlns:o="urn:schemas-microsoft-com:office:office" xmlns:r="http://schemas.openxmlformats.org/officeDocument/2006/relationships" xmlns:m="http://schemas.openxmlformats.org/officeDocument/2006/math" xmlns:v="urn:schemas-microsoft-com:vml" xmlns:wp14="http://schemas.microsoft.com/office/word/2010/wordprocessingDrawing" xmlns:wp="http://schemas.openxmlformats.org/drawingml/2006/wordprocessingDrawing" xmlns:w10="urn:schemas-microsoft-com:office:word" xmlns:w="http://schemas.openxmlformats.org/wordprocessingml/2006/main" xmlns:w14="http://schemas.microsoft.com/office/word/2010/wordml" xmlns:w15="http://schemas.microsoft.com/office/word/2012/wordml" xmlns:wpg="http://schemas.microsoft.com/office/word/2010/wordprocessingGroup" xmlns:wpi="http://schemas.microsoft.com/office/word/2010/wordprocessingInk" xmlns:wne="http://schemas.microsoft.com/office/word/2006/wordml" xmlns:wps="http://schemas.microsoft.com/office/word/2010/wordprocessingShape" mc:Ignorable="w14 w15 wp14">
   <w:p>
     <w:pPr>
       <w:pStyle w:val="Textoindependiente"/>
@@ -5420,6 +5556,7 @@
       <w:rPr>
         <w:noProof/>
         <w:sz w:val="20"/>
+        <w:lang w:eastAsia="es-ES"/>
       </w:rPr>
       <mc:AlternateContent>
         <mc:Choice Requires="wps">
@@ -5482,9 +5619,10 @@
                           </w:r>
                           <w:r>
                             <w:rPr>
+                              <w:noProof/>
                               <w:spacing w:val="-10"/>
                             </w:rPr>
-                            <w:t>2</w:t>
+                            <w:t>9</w:t>
                           </w:r>
                           <w:r>
                             <w:rPr>
@@ -5510,7 +5648,8 @@
               <v:stroke joinstyle="miter"/>
               <v:path gradientshapeok="t" o:connecttype="rect"/>
             </v:shapetype>
-            <v:shape id="Textbox 3" o:spid="_x0000_s1027" type="#_x0000_t202" style="position:absolute;margin-left:501.2pt;margin-top:780.5pt;width:13.15pt;height:14.35pt;z-index:-15872000;visibility:visible;mso-wrap-style:square;mso-wrap-distance-left:0;mso-wrap-distance-top:0;mso-wrap-distance-right:0;mso-wrap-distance-bottom:0;mso-position-horizontal:absolute;mso-position-horizontal-relative:page;mso-position-vertical:absolute;mso-position-vertical-relative:page;v-text-anchor:top" o:gfxdata="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" filled="f" stroked="f">
+            <v:shape id="Textbox 3" o:spid="_x0000_s1027" type="#_x0000_t202" style="position:absolute;margin-left:501.2pt;margin-top:780.5pt;width:13.15pt;height:14.35pt;z-index:-15872000;visibility:visible;mso-wrap-style:square;mso-wrap-distance-left:0;mso-wrap-distance-top:0;mso-wrap-distance-right:0;mso-wrap-distance-bottom:0;mso-position-horizontal:absolute;mso-position-horizontal-relative:page;mso-position-vertical:absolute;mso-position-vertical-relative:page;v-text-anchor:top" o:gfxdata="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" filled="f" stroked="f">
+              <v:path arrowok="t"/>
               <v:textbox inset="0,0,0,0">
                 <w:txbxContent>
                   <w:p>
@@ -5539,9 +5678,10 @@
                     </w:r>
                     <w:r>
                       <w:rPr>
+                        <w:noProof/>
                         <w:spacing w:val="-10"/>
                       </w:rPr>
-                      <w:t>2</w:t>
+                      <w:t>9</w:t>
                     </w:r>
                     <w:r>
                       <w:rPr>
@@ -5563,7 +5703,7 @@
 </file>
 
 <file path=word/footnotes.xml><?xml version="1.0" encoding="utf-8"?>
-<w:footnotes xmlns:wpc="http://schemas.microsoft.com/office/word/2010/wordprocessingCanvas" xmlns:cx="http://schemas.microsoft.com/office/drawing/2014/chartex" xmlns:cx1="http://schemas.microsoft.com/office/drawing/2015/9/8/chartex" xmlns:cx2="http://schemas.microsoft.com/office/drawing/2015/10/21/chartex" xmlns:cx3="http://schemas.microsoft.com/office/drawing/2016/5/9/chartex" xmlns:cx4="http://schemas.microsoft.com/office/drawing/2016/5/10/chartex" xmlns:cx5="http://schemas.microsoft.com/office/drawing/2016/5/11/chartex" xmlns:cx6="http://schemas.microsoft.com/office/drawing/2016/5/12/chartex" xmlns:cx7="http://schemas.microsoft.com/office/drawing/2016/5/13/chartex" xmlns:cx8="http://schemas.microsoft.com/office/drawing/2016/5/14/chartex" xmlns:mc="http://schemas.openxmlformats.org/markup-compatibility/2006" xmlns:aink="http://schemas.microsoft.com/office/drawing/2016/ink" xmlns:am3d="http://schemas.microsoft.com/office/drawing/2017/model3d" xmlns:o="urn:schemas-microsoft-com:office:office" xmlns:oel="http://schemas.microsoft.com/office/2019/extlst" xmlns:r="http://schemas.openxmlformats.org/officeDocument/2006/relationships" xmlns:m="http://schemas.openxmlformats.org/officeDocument/2006/math" xmlns:v="urn:schemas-microsoft-com:vml" xmlns:wp14="http://schemas.microsoft.com/office/word/2010/wordprocessingDrawing" xmlns:wp="http://schemas.openxmlformats.org/drawingml/2006/wordprocessingDrawing" xmlns:w10="urn:schemas-microsoft-com:office:word" xmlns:w="http://schemas.openxmlformats.org/wordprocessingml/2006/main" xmlns:w14="http://schemas.microsoft.com/office/word/2010/wordml" xmlns:w15="http://schemas.microsoft.com/office/word/2012/wordml" xmlns:w16cex="http://schemas.microsoft.com/office/word/2018/wordml/cex" xmlns:w16cid="http://schemas.microsoft.com/office/word/2016/wordml/cid" xmlns:w16="http://schemas.microsoft.com/office/word/2018/wordml" xmlns:w16du="http://schemas.microsoft.com/office/word/2023/wordml/word16du" xmlns:w16sdtdh="http://schemas.microsoft.com/office/word/2020/wordml/sdtdatahash" xmlns:w16sdtfl="http://schemas.microsoft.com/office/word/2024/wordml/sdtformatlock" xmlns:w16se="http://schemas.microsoft.com/office/word/2015/wordml/symex" xmlns:wpg="http://schemas.microsoft.com/office/word/2010/wordprocessingGroup" xmlns:wpi="http://schemas.microsoft.com/office/word/2010/wordprocessingInk" xmlns:wne="http://schemas.microsoft.com/office/word/2006/wordml" xmlns:wps="http://schemas.microsoft.com/office/word/2010/wordprocessingShape" mc:Ignorable="w14 w15 w16se w16cid w16 w16cex w16sdtdh w16sdtfl w16du wp14">
+<w:footnotes xmlns:wpc="http://schemas.microsoft.com/office/word/2010/wordprocessingCanvas" xmlns:mc="http://schemas.openxmlformats.org/markup-compatibility/2006" xmlns:o="urn:schemas-microsoft-com:office:office" xmlns:r="http://schemas.openxmlformats.org/officeDocument/2006/relationships" xmlns:m="http://schemas.openxmlformats.org/officeDocument/2006/math" xmlns:v="urn:schemas-microsoft-com:vml" xmlns:wp14="http://schemas.microsoft.com/office/word/2010/wordprocessingDrawing" xmlns:wp="http://schemas.openxmlformats.org/drawingml/2006/wordprocessingDrawing" xmlns:w10="urn:schemas-microsoft-com:office:word" xmlns:w="http://schemas.openxmlformats.org/wordprocessingml/2006/main" xmlns:w14="http://schemas.microsoft.com/office/word/2010/wordml" xmlns:w15="http://schemas.microsoft.com/office/word/2012/wordml" xmlns:wpg="http://schemas.microsoft.com/office/word/2010/wordprocessingGroup" xmlns:wpi="http://schemas.microsoft.com/office/word/2010/wordprocessingInk" xmlns:wne="http://schemas.microsoft.com/office/word/2006/wordml" xmlns:wps="http://schemas.microsoft.com/office/word/2010/wordprocessingShape" mc:Ignorable="w14 w15 wp14">
   <w:footnote w:type="separator" w:id="-1">
     <w:p>
       <w:r>
@@ -5582,7 +5722,7 @@
 </file>
 
 <file path=word/header1.xml><?xml version="1.0" encoding="utf-8"?>
-<w:hdr xmlns:wpc="http://schemas.microsoft.com/office/word/2010/wordprocessingCanvas" xmlns:cx="http://schemas.microsoft.com/office/drawing/2014/chartex" xmlns:cx1="http://schemas.microsoft.com/office/drawing/2015/9/8/chartex" xmlns:cx2="http://schemas.microsoft.com/office/drawing/2015/10/21/chartex" xmlns:cx3="http://schemas.microsoft.com/office/drawing/2016/5/9/chartex" xmlns:cx4="http://schemas.microsoft.com/office/drawing/2016/5/10/chartex" xmlns:cx5="http://schemas.microsoft.com/office/drawing/2016/5/11/chartex" xmlns:cx6="http://schemas.microsoft.com/office/drawing/2016/5/12/chartex" xmlns:cx7="http://schemas.microsoft.com/office/drawing/2016/5/13/chartex" xmlns:cx8="http://schemas.microsoft.com/office/drawing/2016/5/14/chartex" xmlns:mc="http://schemas.openxmlformats.org/markup-compatibility/2006" xmlns:aink="http://schemas.microsoft.com/office/drawing/2016/ink" xmlns:am3d="http://schemas.microsoft.com/office/drawing/2017/model3d" xmlns:o="urn:schemas-microsoft-com:office:office" xmlns:oel="http://schemas.microsoft.com/office/2019/extlst" xmlns:r="http://schemas.openxmlformats.org/officeDocument/2006/relationships" xmlns:m="http://schemas.openxmlformats.org/officeDocument/2006/math" xmlns:v="urn:schemas-microsoft-com:vml" xmlns:wp14="http://schemas.microsoft.com/office/word/2010/wordprocessingDrawing" xmlns:wp="http://schemas.openxmlformats.org/drawingml/2006/wordprocessingDrawing" xmlns:w10="urn:schemas-microsoft-com:office:word" xmlns:w="http://schemas.openxmlformats.org/wordprocessingml/2006/main" xmlns:w14="http://schemas.microsoft.com/office/word/2010/wordml" xmlns:w15="http://schemas.microsoft.com/office/word/2012/wordml" xmlns:w16cex="http://schemas.microsoft.com/office/word/2018/wordml/cex" xmlns:w16cid="http://schemas.microsoft.com/office/word/2016/wordml/cid" xmlns:w16="http://schemas.microsoft.com/office/word/2018/wordml" xmlns:w16du="http://schemas.microsoft.com/office/word/2023/wordml/word16du" xmlns:w16sdtdh="http://schemas.microsoft.com/office/word/2020/wordml/sdtdatahash" xmlns:w16sdtfl="http://schemas.microsoft.com/office/word/2024/wordml/sdtformatlock" xmlns:w16se="http://schemas.microsoft.com/office/word/2015/wordml/symex" xmlns:wpg="http://schemas.microsoft.com/office/word/2010/wordprocessingGroup" xmlns:wpi="http://schemas.microsoft.com/office/word/2010/wordprocessingInk" xmlns:wne="http://schemas.microsoft.com/office/word/2006/wordml" xmlns:wps="http://schemas.microsoft.com/office/word/2010/wordprocessingShape" mc:Ignorable="w14 w15 w16se w16cid w16 w16cex w16sdtdh w16sdtfl w16du wp14">
+<w:hdr xmlns:wpc="http://schemas.microsoft.com/office/word/2010/wordprocessingCanvas" xmlns:mc="http://schemas.openxmlformats.org/markup-compatibility/2006" xmlns:o="urn:schemas-microsoft-com:office:office" xmlns:r="http://schemas.openxmlformats.org/officeDocument/2006/relationships" xmlns:m="http://schemas.openxmlformats.org/officeDocument/2006/math" xmlns:v="urn:schemas-microsoft-com:vml" xmlns:wp14="http://schemas.microsoft.com/office/word/2010/wordprocessingDrawing" xmlns:wp="http://schemas.openxmlformats.org/drawingml/2006/wordprocessingDrawing" xmlns:w10="urn:schemas-microsoft-com:office:word" xmlns:w="http://schemas.openxmlformats.org/wordprocessingml/2006/main" xmlns:w14="http://schemas.microsoft.com/office/word/2010/wordml" xmlns:w15="http://schemas.microsoft.com/office/word/2012/wordml" xmlns:wpg="http://schemas.microsoft.com/office/word/2010/wordprocessingGroup" xmlns:wpi="http://schemas.microsoft.com/office/word/2010/wordprocessingInk" xmlns:wne="http://schemas.microsoft.com/office/word/2006/wordml" xmlns:wps="http://schemas.microsoft.com/office/word/2010/wordprocessingShape" mc:Ignorable="w14 w15 wp14">
   <w:p>
     <w:pPr>
       <w:pStyle w:val="Textoindependiente"/>
@@ -5595,6 +5735,7 @@
       <w:rPr>
         <w:noProof/>
         <w:sz w:val="20"/>
+        <w:lang w:eastAsia="es-ES"/>
       </w:rPr>
       <mc:AlternateContent>
         <mc:Choice Requires="wps">
@@ -5733,7 +5874,8 @@
               <v:stroke joinstyle="miter"/>
               <v:path gradientshapeok="t" o:connecttype="rect"/>
             </v:shapetype>
-            <v:shape id="Textbox 2" o:spid="_x0000_s1026" type="#_x0000_t202" style="position:absolute;margin-left:84.1pt;margin-top:34.6pt;width:267.25pt;height:14.35pt;z-index:-15872512;visibility:visible;mso-wrap-style:square;mso-wrap-distance-left:0;mso-wrap-distance-top:0;mso-wrap-distance-right:0;mso-wrap-distance-bottom:0;mso-position-horizontal:absolute;mso-position-horizontal-relative:page;mso-position-vertical:absolute;mso-position-vertical-relative:page;v-text-anchor:top" o:gfxdata="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" filled="f" stroked="f">
+            <v:shape id="Textbox 2" o:spid="_x0000_s1026" type="#_x0000_t202" style="position:absolute;margin-left:84.1pt;margin-top:34.6pt;width:267.25pt;height:14.35pt;z-index:-15872512;visibility:visible;mso-wrap-style:square;mso-wrap-distance-left:0;mso-wrap-distance-top:0;mso-wrap-distance-right:0;mso-wrap-distance-bottom:0;mso-position-horizontal:absolute;mso-position-horizontal-relative:page;mso-position-vertical:absolute;mso-position-vertical-relative:page;v-text-anchor:top" o:gfxdata="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" filled="f" stroked="f">
+              <v:path arrowok="t"/>
               <v:textbox inset="0,0,0,0">
                 <w:txbxContent>
                   <w:p>
@@ -5834,7 +5976,7 @@
 </file>
 
 <file path=word/styles.xml><?xml version="1.0" encoding="utf-8"?>
-<w:styles xmlns:mc="http://schemas.openxmlformats.org/markup-compatibility/2006" xmlns:r="http://schemas.openxmlformats.org/officeDocument/2006/relationships" xmlns:w="http://schemas.openxmlformats.org/wordprocessingml/2006/main" xmlns:w14="http://schemas.microsoft.com/office/word/2010/wordml" xmlns:w15="http://schemas.microsoft.com/office/word/2012/wordml" xmlns:w16cex="http://schemas.microsoft.com/office/word/2018/wordml/cex" xmlns:w16cid="http://schemas.microsoft.com/office/word/2016/wordml/cid" xmlns:w16="http://schemas.microsoft.com/office/word/2018/wordml" xmlns:w16du="http://schemas.microsoft.com/office/word/2023/wordml/word16du" xmlns:w16sdtdh="http://schemas.microsoft.com/office/word/2020/wordml/sdtdatahash" xmlns:w16sdtfl="http://schemas.microsoft.com/office/word/2024/wordml/sdtformatlock" xmlns:w16se="http://schemas.microsoft.com/office/word/2015/wordml/symex" mc:Ignorable="w14 w15 w16se w16cid w16 w16cex w16sdtdh w16sdtfl w16du">
+<w:styles xmlns:mc="http://schemas.openxmlformats.org/markup-compatibility/2006" xmlns:r="http://schemas.openxmlformats.org/officeDocument/2006/relationships" xmlns:w="http://schemas.openxmlformats.org/wordprocessingml/2006/main" xmlns:w14="http://schemas.microsoft.com/office/word/2010/wordml" xmlns:w15="http://schemas.microsoft.com/office/word/2012/wordml" mc:Ignorable="w14 w15">
   <w:docDefaults>
     <w:rPrDefault>
       <w:rPr>
@@ -5852,7 +5994,7 @@
       </w:pPr>
     </w:pPrDefault>
   </w:docDefaults>
-  <w:latentStyles w:defLockedState="0" w:defUIPriority="99" w:defSemiHidden="0" w:defUnhideWhenUsed="0" w:defQFormat="0" w:count="376">
+  <w:latentStyles w:defLockedState="0" w:defUIPriority="99" w:defSemiHidden="0" w:defUnhideWhenUsed="0" w:defQFormat="0" w:count="371">
     <w:lsdException w:name="Normal" w:uiPriority="0" w:qFormat="1"/>
     <w:lsdException w:name="heading 1" w:uiPriority="9" w:qFormat="1"/>
     <w:lsdException w:name="heading 2" w:semiHidden="1" w:uiPriority="9" w:unhideWhenUsed="1" w:qFormat="1"/>
@@ -6224,11 +6366,6 @@
     <w:lsdException w:name="List Table 5 Dark Accent 6" w:uiPriority="50"/>
     <w:lsdException w:name="List Table 6 Colorful Accent 6" w:uiPriority="51"/>
     <w:lsdException w:name="List Table 7 Colorful Accent 6" w:uiPriority="52"/>
-    <w:lsdException w:name="Mention" w:semiHidden="1" w:unhideWhenUsed="1"/>
-    <w:lsdException w:name="Smart Hyperlink" w:semiHidden="1" w:unhideWhenUsed="1"/>
-    <w:lsdException w:name="Hashtag" w:semiHidden="1" w:unhideWhenUsed="1"/>
-    <w:lsdException w:name="Unresolved Mention" w:semiHidden="1" w:unhideWhenUsed="1"/>
-    <w:lsdException w:name="Smart Link" w:semiHidden="1" w:unhideWhenUsed="1"/>
   </w:latentStyles>
   <w:style w:type="paragraph" w:default="1" w:styleId="Normal">
     <w:name w:val="Normal"/>
@@ -6288,7 +6425,7 @@
     <w:uiPriority w:val="1"/>
     <w:qFormat/>
   </w:style>
-  <w:style w:type="paragraph" w:styleId="Ttulo">
+  <w:style w:type="paragraph" w:styleId="Puesto">
     <w:name w:val="Title"/>
     <w:basedOn w:val="Normal"/>
     <w:uiPriority w:val="10"/>

</xml_diff>

<commit_message>
añadido algunos analisis electricos
</commit_message>
<xml_diff>
--- a/Planificacion/Words/G1_PLANIFICACIÓN_ SEGUIMIENTO_CALIDAD.docx
+++ b/Planificacion/Words/G1_PLANIFICACIÓN_ SEGUIMIENTO_CALIDAD.docx
@@ -1,10 +1,10 @@
 
 <file path=word/document.xml><?xml version="1.0" encoding="utf-8"?>
-<w:document xmlns:wpc="http://schemas.microsoft.com/office/word/2010/wordprocessingCanvas" xmlns:mc="http://schemas.openxmlformats.org/markup-compatibility/2006" xmlns:o="urn:schemas-microsoft-com:office:office" xmlns:r="http://schemas.openxmlformats.org/officeDocument/2006/relationships" xmlns:m="http://schemas.openxmlformats.org/officeDocument/2006/math" xmlns:v="urn:schemas-microsoft-com:vml" xmlns:wp14="http://schemas.microsoft.com/office/word/2010/wordprocessingDrawing" xmlns:wp="http://schemas.openxmlformats.org/drawingml/2006/wordprocessingDrawing" xmlns:w10="urn:schemas-microsoft-com:office:word" xmlns:w="http://schemas.openxmlformats.org/wordprocessingml/2006/main" xmlns:w14="http://schemas.microsoft.com/office/word/2010/wordml" xmlns:w15="http://schemas.microsoft.com/office/word/2012/wordml" xmlns:wpg="http://schemas.microsoft.com/office/word/2010/wordprocessingGroup" xmlns:wpi="http://schemas.microsoft.com/office/word/2010/wordprocessingInk" xmlns:wne="http://schemas.microsoft.com/office/word/2006/wordml" xmlns:wps="http://schemas.microsoft.com/office/word/2010/wordprocessingShape" mc:Ignorable="w14 w15 wp14">
+<w:document xmlns:wpc="http://schemas.microsoft.com/office/word/2010/wordprocessingCanvas" xmlns:cx="http://schemas.microsoft.com/office/drawing/2014/chartex" xmlns:cx1="http://schemas.microsoft.com/office/drawing/2015/9/8/chartex" xmlns:cx2="http://schemas.microsoft.com/office/drawing/2015/10/21/chartex" xmlns:cx3="http://schemas.microsoft.com/office/drawing/2016/5/9/chartex" xmlns:cx4="http://schemas.microsoft.com/office/drawing/2016/5/10/chartex" xmlns:cx5="http://schemas.microsoft.com/office/drawing/2016/5/11/chartex" xmlns:cx6="http://schemas.microsoft.com/office/drawing/2016/5/12/chartex" xmlns:cx7="http://schemas.microsoft.com/office/drawing/2016/5/13/chartex" xmlns:cx8="http://schemas.microsoft.com/office/drawing/2016/5/14/chartex" xmlns:mc="http://schemas.openxmlformats.org/markup-compatibility/2006" xmlns:aink="http://schemas.microsoft.com/office/drawing/2016/ink" xmlns:am3d="http://schemas.microsoft.com/office/drawing/2017/model3d" xmlns:o="urn:schemas-microsoft-com:office:office" xmlns:oel="http://schemas.microsoft.com/office/2019/extlst" xmlns:r="http://schemas.openxmlformats.org/officeDocument/2006/relationships" xmlns:m="http://schemas.openxmlformats.org/officeDocument/2006/math" xmlns:v="urn:schemas-microsoft-com:vml" xmlns:wp14="http://schemas.microsoft.com/office/word/2010/wordprocessingDrawing" xmlns:wp="http://schemas.openxmlformats.org/drawingml/2006/wordprocessingDrawing" xmlns:w10="urn:schemas-microsoft-com:office:word" xmlns:w="http://schemas.openxmlformats.org/wordprocessingml/2006/main" xmlns:w14="http://schemas.microsoft.com/office/word/2010/wordml" xmlns:w15="http://schemas.microsoft.com/office/word/2012/wordml" xmlns:w16cex="http://schemas.microsoft.com/office/word/2018/wordml/cex" xmlns:w16cid="http://schemas.microsoft.com/office/word/2016/wordml/cid" xmlns:w16="http://schemas.microsoft.com/office/word/2018/wordml" xmlns:w16du="http://schemas.microsoft.com/office/word/2023/wordml/word16du" xmlns:w16sdtdh="http://schemas.microsoft.com/office/word/2020/wordml/sdtdatahash" xmlns:w16sdtfl="http://schemas.microsoft.com/office/word/2024/wordml/sdtformatlock" xmlns:w16se="http://schemas.microsoft.com/office/word/2015/wordml/symex" xmlns:wpg="http://schemas.microsoft.com/office/word/2010/wordprocessingGroup" xmlns:wpi="http://schemas.microsoft.com/office/word/2010/wordprocessingInk" xmlns:wne="http://schemas.microsoft.com/office/word/2006/wordml" xmlns:wps="http://schemas.microsoft.com/office/word/2010/wordprocessingShape" mc:Ignorable="w14 w15 w16se w16cid w16 w16cex w16sdtdh w16sdtfl w16du wp14">
   <w:body>
     <w:p>
       <w:pPr>
-        <w:pStyle w:val="Puesto"/>
+        <w:pStyle w:val="Ttulo"/>
       </w:pPr>
       <w:r>
         <w:t>Plan</w:t>
@@ -995,13 +995,8 @@
               </w:rPr>
               <w:t xml:space="preserve"> </w:t>
             </w:r>
-            <w:proofErr w:type="gramStart"/>
-            <w:r>
-              <w:t>esquemático</w:t>
-            </w:r>
-            <w:proofErr w:type="gramEnd"/>
-            <w:r>
-              <w:t>.</w:t>
+            <w:r>
+              <w:t>esquemático.</w:t>
             </w:r>
             <w:r>
               <w:rPr>
@@ -1305,13 +1300,8 @@
               </w:rPr>
               <w:t xml:space="preserve"> </w:t>
             </w:r>
-            <w:proofErr w:type="gramStart"/>
-            <w:r>
-              <w:t>esquemático</w:t>
-            </w:r>
-            <w:proofErr w:type="gramEnd"/>
-            <w:r>
-              <w:t>.</w:t>
+            <w:r>
+              <w:t>esquemático.</w:t>
             </w:r>
             <w:r>
               <w:rPr>
@@ -1452,7 +1442,7 @@
               <w:rPr>
                 <w:rFonts w:ascii="Times New Roman"/>
               </w:rPr>
-              <w:t>8</w:t>
+              <w:t>9</w:t>
             </w:r>
             <w:r>
               <w:rPr>
@@ -1712,15 +1702,7 @@
               <w:t xml:space="preserve"> </w:t>
             </w:r>
             <w:r>
-              <w:t>(</w:t>
-            </w:r>
-            <w:proofErr w:type="spellStart"/>
-            <w:r>
-              <w:t>gerber</w:t>
-            </w:r>
-            <w:proofErr w:type="spellEnd"/>
-            <w:r>
-              <w:t>)</w:t>
+              <w:t>(gerber)</w:t>
             </w:r>
           </w:p>
         </w:tc>
@@ -1986,15 +1968,7 @@
               <w:t xml:space="preserve"> </w:t>
             </w:r>
             <w:r>
-              <w:t>(</w:t>
-            </w:r>
-            <w:proofErr w:type="spellStart"/>
-            <w:r>
-              <w:t>gerber</w:t>
-            </w:r>
-            <w:proofErr w:type="spellEnd"/>
-            <w:r>
-              <w:t>)</w:t>
+              <w:t>(gerber)</w:t>
             </w:r>
           </w:p>
         </w:tc>
@@ -2486,23 +2460,7 @@
                 <w:rFonts w:ascii="Arial" w:hAnsi="Arial"/>
                 <w:b/>
               </w:rPr>
-              <w:t>(</w:t>
-            </w:r>
-            <w:proofErr w:type="spellStart"/>
-            <w:r>
-              <w:rPr>
-                <w:rFonts w:ascii="Arial" w:hAnsi="Arial"/>
-                <w:b/>
-              </w:rPr>
-              <w:t>uC</w:t>
-            </w:r>
-            <w:proofErr w:type="spellEnd"/>
-            <w:r>
-              <w:rPr>
-                <w:rFonts w:ascii="Arial" w:hAnsi="Arial"/>
-                <w:b/>
-              </w:rPr>
-              <w:t>/FPGA).</w:t>
+              <w:t>(uC/FPGA).</w:t>
             </w:r>
             <w:r>
               <w:rPr>
@@ -2735,23 +2693,7 @@
                 <w:rFonts w:ascii="Arial" w:hAnsi="Arial"/>
                 <w:b/>
               </w:rPr>
-              <w:t>(</w:t>
-            </w:r>
-            <w:proofErr w:type="spellStart"/>
-            <w:r>
-              <w:rPr>
-                <w:rFonts w:ascii="Arial" w:hAnsi="Arial"/>
-                <w:b/>
-              </w:rPr>
-              <w:t>uC</w:t>
-            </w:r>
-            <w:proofErr w:type="spellEnd"/>
-            <w:r>
-              <w:rPr>
-                <w:rFonts w:ascii="Arial" w:hAnsi="Arial"/>
-                <w:b/>
-              </w:rPr>
-              <w:t>/FPGA).</w:t>
+              <w:t>(uC/FPGA).</w:t>
             </w:r>
             <w:r>
               <w:rPr>
@@ -3970,13 +3912,8 @@
         </w:rPr>
         <w:t xml:space="preserve"> </w:t>
       </w:r>
-      <w:proofErr w:type="spellStart"/>
-      <w:r>
-        <w:t>proteus</w:t>
-      </w:r>
-      <w:proofErr w:type="spellEnd"/>
-      <w:r>
-        <w:t>,</w:t>
+      <w:r>
+        <w:t>proteus,</w:t>
       </w:r>
       <w:r>
         <w:rPr>
@@ -4093,23 +4030,7 @@
         <w:t xml:space="preserve"> </w:t>
       </w:r>
       <w:r>
-        <w:t xml:space="preserve">de las </w:t>
-      </w:r>
-      <w:proofErr w:type="spellStart"/>
-      <w:r>
-        <w:t>PBC’s</w:t>
-      </w:r>
-      <w:proofErr w:type="spellEnd"/>
-      <w:r>
-        <w:t xml:space="preserve"> y </w:t>
-      </w:r>
-      <w:proofErr w:type="spellStart"/>
-      <w:r>
-        <w:t>Victor</w:t>
-      </w:r>
-      <w:proofErr w:type="spellEnd"/>
-      <w:r>
-        <w:t xml:space="preserve"> y Clara terminaron el diagrama Gantt (1h). El miércoles por la tarde Miguel dedicó tiempo extra en la realización de los esquemáticos del PCB2 (2h). En la clase del viernes continuamos con el</w:t>
+        <w:t>de las PBC’s y Victor y Clara terminaron el diagrama Gantt (1h). El miércoles por la tarde Miguel dedicó tiempo extra en la realización de los esquemáticos del PCB2 (2h). En la clase del viernes continuamos con el</w:t>
       </w:r>
       <w:r>
         <w:rPr>
@@ -4118,23 +4039,7 @@
         <w:t xml:space="preserve"> </w:t>
       </w:r>
       <w:r>
-        <w:t xml:space="preserve">desarrollo de los diseños de los esquemáticos de las </w:t>
-      </w:r>
-      <w:proofErr w:type="spellStart"/>
-      <w:r>
-        <w:t>PBC’s</w:t>
-      </w:r>
-      <w:proofErr w:type="spellEnd"/>
-      <w:r>
-        <w:t xml:space="preserve"> (2.5h). En esta sesión se finalizaron los esquemáticos de las PCB1, PCB2 y PCB3, desarrollados por Mario, Miguel y </w:t>
-      </w:r>
-      <w:proofErr w:type="spellStart"/>
-      <w:r>
-        <w:t>Victor</w:t>
-      </w:r>
-      <w:proofErr w:type="spellEnd"/>
-      <w:r>
-        <w:t xml:space="preserve"> respectivamente. Clara comenzó el desarrollo de los esquemáticos correspondientes al PBC0.</w:t>
+        <w:t>desarrollo de los diseños de los esquemáticos de las PBC’s (2.5h). En esta sesión se finalizaron los esquemáticos de las PCB1, PCB2 y PCB3, desarrollados por Mario, Miguel y Victor respectivamente. Clara comenzó el desarrollo de los esquemáticos correspondientes al PBC0.</w:t>
       </w:r>
     </w:p>
     <w:p>
@@ -5176,18 +5081,8 @@
           <w:spacing w:val="13"/>
           <w:sz w:val="28"/>
         </w:rPr>
-        <w:t xml:space="preserve"> Cálculo de costes y diseño de las </w:t>
-      </w:r>
-      <w:proofErr w:type="spellStart"/>
-      <w:r>
-        <w:rPr>
-          <w:color w:val="585858"/>
-          <w:spacing w:val="13"/>
-          <w:sz w:val="28"/>
-        </w:rPr>
-        <w:t>PCBs</w:t>
-      </w:r>
-      <w:proofErr w:type="spellEnd"/>
+        <w:t xml:space="preserve"> Cálculo de costes y diseño de las PCBs</w:t>
+      </w:r>
       <w:r>
         <w:rPr>
           <w:color w:val="585858"/>
@@ -5203,34 +5098,13 @@
         <w:jc w:val="both"/>
       </w:pPr>
       <w:r>
-        <w:t xml:space="preserve">En la sesión del martes se han realizado labores de actualización y refinado de los esquemáticos. Mario y Miguel comenzaron con la especificación de las </w:t>
-      </w:r>
-      <w:proofErr w:type="spellStart"/>
-      <w:r>
-        <w:t>PCBs</w:t>
-      </w:r>
-      <w:proofErr w:type="spellEnd"/>
-      <w:r>
-        <w:t xml:space="preserve"> mientras que Víctor y Clara se encargaban de comenzar con las hojas de coste y actualización </w:t>
+        <w:t xml:space="preserve">En la sesión del martes se han realizado labores de actualización y refinado de los esquemáticos. Mario y Miguel comenzaron con la especificación de las PCBs mientras que Víctor y Clara se encargaban de comenzar con las hojas de coste y actualización </w:t>
       </w:r>
       <w:r>
         <w:t>de los diagramas</w:t>
       </w:r>
       <w:r>
-        <w:t xml:space="preserve"> </w:t>
-      </w:r>
-      <w:proofErr w:type="spellStart"/>
-      <w:proofErr w:type="gramStart"/>
-      <w:r>
-        <w:t>Gant</w:t>
-      </w:r>
-      <w:proofErr w:type="spellEnd"/>
-      <w:r>
-        <w:t>(</w:t>
-      </w:r>
-      <w:proofErr w:type="gramEnd"/>
-      <w:r>
-        <w:t xml:space="preserve">1h). Clara dedico tiempo el jueves por la tarde para crear el logo y pensar en un nombre para nuestro </w:t>
+        <w:t xml:space="preserve"> Gant(1h). Clara dedico tiempo el jueves por la tarde para crear el logo y pensar en un nombre para nuestro </w:t>
       </w:r>
       <w:r>
         <w:t>grupo (</w:t>
@@ -5246,20 +5120,7 @@
       </w:pPr>
       <w:r>
         <w:br/>
-        <w:t xml:space="preserve">En la sesión del viernes se continuo con las labores empezadas el martes dejando prácticamente acabadas las </w:t>
-      </w:r>
-      <w:proofErr w:type="spellStart"/>
-      <w:proofErr w:type="gramStart"/>
-      <w:r>
-        <w:t>PCBs</w:t>
-      </w:r>
-      <w:proofErr w:type="spellEnd"/>
-      <w:r>
-        <w:t>(</w:t>
-      </w:r>
-      <w:proofErr w:type="gramEnd"/>
-      <w:r>
-        <w:t xml:space="preserve">dos de ellas no se van a poder mostrar por problemas para poder acceder a ellas al no haberse guardado </w:t>
+        <w:t xml:space="preserve">En la sesión del viernes se continuo con las labores empezadas el martes dejando prácticamente acabadas las PCBs(dos de ellas no se van a poder mostrar por problemas para poder acceder a ellas al no haberse guardado </w:t>
       </w:r>
       <w:r>
         <w:t>correctamente) (</w:t>
@@ -5280,13 +5141,8 @@
         <w:jc w:val="both"/>
       </w:pPr>
       <w:r>
-        <w:t xml:space="preserve">Los esquemáticos se van a guardar en el Anexo 1 para así aligerar el peso de este archivo, y lo mismo se va a hacer con las </w:t>
-      </w:r>
-      <w:proofErr w:type="spellStart"/>
-      <w:r>
-        <w:t>PCBs</w:t>
-      </w:r>
-      <w:proofErr w:type="spellEnd"/>
+        <w:t>Los esquemáticos se van a guardar en el Anexo 1 para así aligerar el peso de este archivo, y lo mismo se va a hacer con las PCBs</w:t>
+      </w:r>
       <w:r>
         <w:t xml:space="preserve"> en el Anexo 2</w:t>
       </w:r>
@@ -5496,15 +5352,7 @@
         <w:t>enseñó</w:t>
       </w:r>
       <w:r>
-        <w:t xml:space="preserve"> </w:t>
-      </w:r>
-      <w:proofErr w:type="spellStart"/>
-      <w:r>
-        <w:t>como</w:t>
-      </w:r>
-      <w:proofErr w:type="spellEnd"/>
-      <w:r>
-        <w:t xml:space="preserve"> crear las huellas de los componentes y analizar el consumo eléctrico (1H). </w:t>
+        <w:t xml:space="preserve"> como crear las huellas de los componentes y analizar el consumo eléctrico (1H). </w:t>
       </w:r>
       <w:r>
         <w:t>Además</w:t>
@@ -5566,15 +5414,7 @@
       </w:pPr>
       <w:r>
         <w:lastRenderedPageBreak/>
-        <w:t xml:space="preserve">El martes, Miguel y Mario continuaron con las </w:t>
-      </w:r>
-      <w:proofErr w:type="spellStart"/>
-      <w:r>
-        <w:t>PCBs</w:t>
-      </w:r>
-      <w:proofErr w:type="spellEnd"/>
-      <w:r>
-        <w:t>. Se diseñaron y crearon las huellas faltantes y se finalizó el posicionamiento de todas las huellas para las cuatro placas de circuito impreso. Se diseñó la antena y se realizaron los cambios correspondientes en su esquemático. Víctor y Clara continuaron con la planificación, la documentación, el BOM y comenzaron a elaborar el análisis térmico y eléctrico.</w:t>
+        <w:t>El martes, Miguel y Mario continuaron con las PCBs. Se diseñaron y crearon las huellas faltantes y se finalizó el posicionamiento de todas las huellas para las cuatro placas de circuito impreso. Se diseñó la antena y se realizaron los cambios correspondientes en su esquemático. Víctor y Clara continuaron con la planificación, la documentación, el BOM y comenzaron a elaborar el análisis térmico y eléctrico.</w:t>
       </w:r>
     </w:p>
     <w:p>
@@ -5678,15 +5518,7 @@
         <w:t>, finalizó</w:t>
       </w:r>
       <w:r>
-        <w:t xml:space="preserve"> las </w:t>
-      </w:r>
-      <w:proofErr w:type="spellStart"/>
-      <w:r>
-        <w:t>PCB’s</w:t>
-      </w:r>
-      <w:proofErr w:type="spellEnd"/>
-      <w:r>
-        <w:t xml:space="preserve">  2 y 3, además de hacer el rutado de conexiones </w:t>
+        <w:t xml:space="preserve"> las PCB’s  2 y 3, además de hacer el rutado de conexiones </w:t>
       </w:r>
       <w:r>
         <w:t xml:space="preserve">de estas PCB </w:t>
@@ -5705,24 +5537,169 @@
         <w:jc w:val="both"/>
       </w:pPr>
       <w:r>
+        <w:object w:dxaOrig="8925" w:dyaOrig="12630" w14:anchorId="29AAC049">
+          <v:shapetype id="_x0000_t75" coordsize="21600,21600" o:spt="75" o:preferrelative="t" path="m@4@5l@4@11@9@11@9@5xe" filled="f" stroked="f">
+            <v:stroke joinstyle="miter"/>
+            <v:formulas>
+              <v:f eqn="if lineDrawn pixelLineWidth 0"/>
+              <v:f eqn="sum @0 1 0"/>
+              <v:f eqn="sum 0 0 @1"/>
+              <v:f eqn="prod @2 1 2"/>
+              <v:f eqn="prod @3 21600 pixelWidth"/>
+              <v:f eqn="prod @3 21600 pixelHeight"/>
+              <v:f eqn="sum @0 0 1"/>
+              <v:f eqn="prod @6 1 2"/>
+              <v:f eqn="prod @7 21600 pixelWidth"/>
+              <v:f eqn="sum @8 21600 0"/>
+              <v:f eqn="prod @7 21600 pixelHeight"/>
+              <v:f eqn="sum @10 21600 0"/>
+            </v:formulas>
+            <v:path o:extrusionok="f" gradientshapeok="t" o:connecttype="rect"/>
+            <o:lock v:ext="edit" aspectratio="t"/>
+          </v:shapetype>
+          <v:shape id="_x0000_i1025" type="#_x0000_t75" style="width:193.55pt;height:273.05pt" o:ole="">
+            <v:imagedata r:id="rId16" o:title=""/>
+          </v:shape>
+          <o:OLEObject Type="Embed" ProgID="Acrobat.Document.DC" ShapeID="_x0000_i1025" DrawAspect="Content" ObjectID="_1822420596" r:id="rId17"/>
+        </w:object>
+      </w:r>
+    </w:p>
+    <w:p>
+      <w:pPr>
+        <w:jc w:val="both"/>
+      </w:pPr>
+      <w:r>
         <w:t xml:space="preserve">Durante la sesión del viernes en el laboratorio se nos indicó cambios que debíamos hacer sobre los esquemáticos y las PCB, y nos pusimos a realizar estos cambios. </w:t>
       </w:r>
       <w:r>
-        <w:t xml:space="preserve">Actualizamos la documentación, se finalizaron las </w:t>
-      </w:r>
-      <w:proofErr w:type="spellStart"/>
-      <w:r>
-        <w:t>PCBs</w:t>
-      </w:r>
-      <w:proofErr w:type="spellEnd"/>
-      <w:r>
-        <w:t xml:space="preserve"> 0 y 1 y sus rutados de conexiones. </w:t>
-      </w:r>
-      <w:bookmarkStart w:id="0" w:name="_GoBack"/>
-      <w:bookmarkEnd w:id="0"/>
+        <w:t xml:space="preserve">Actualizamos la documentación, se finalizaron las PCBs 0 y 1 y sus rutados de conexiones. </w:t>
+      </w:r>
       <w:r>
         <w:t>También continuamos con el análisis eléctrico. (2h)</w:t>
       </w:r>
+    </w:p>
+    <w:p>
+      <w:pPr>
+        <w:jc w:val="both"/>
+      </w:pPr>
+    </w:p>
+    <w:p>
+      <w:pPr>
+        <w:jc w:val="both"/>
+      </w:pPr>
+      <w:r>
+        <w:t xml:space="preserve">El domingo Víctor finalizó el análisis eléctrico de la PCB 1 Y 3 (1h). </w:t>
+      </w:r>
+    </w:p>
+    <w:p>
+      <w:pPr>
+        <w:jc w:val="both"/>
+      </w:pPr>
+    </w:p>
+    <w:p>
+      <w:pPr>
+        <w:jc w:val="both"/>
+      </w:pPr>
+      <w:r>
+        <w:object w:dxaOrig="27998" w:dyaOrig="8799" w14:anchorId="047B8D9A">
+          <v:shape id="_x0000_i1028" type="#_x0000_t75" style="width:477.8pt;height:149.6pt" o:ole="">
+            <v:imagedata r:id="rId18" o:title=""/>
+          </v:shape>
+          <o:OLEObject Type="Embed" ProgID="Excel.Sheet.12" ShapeID="_x0000_i1028" DrawAspect="Content" ObjectID="_1822420597" r:id="rId19"/>
+        </w:object>
+      </w:r>
+    </w:p>
+    <w:p>
+      <w:pPr>
+        <w:spacing w:before="156"/>
+        <w:jc w:val="both"/>
+        <w:rPr>
+          <w:sz w:val="28"/>
+        </w:rPr>
+      </w:pPr>
+      <w:r>
+        <w:rPr>
+          <w:color w:val="585858"/>
+          <w:spacing w:val="11"/>
+          <w:sz w:val="28"/>
+        </w:rPr>
+        <w:t>Semana</w:t>
+      </w:r>
+      <w:r>
+        <w:rPr>
+          <w:color w:val="585858"/>
+          <w:spacing w:val="35"/>
+          <w:sz w:val="28"/>
+        </w:rPr>
+        <w:t xml:space="preserve"> </w:t>
+      </w:r>
+      <w:r>
+        <w:rPr>
+          <w:color w:val="585858"/>
+          <w:spacing w:val="14"/>
+          <w:sz w:val="28"/>
+        </w:rPr>
+        <w:t>20</w:t>
+      </w:r>
+      <w:r>
+        <w:rPr>
+          <w:color w:val="585858"/>
+          <w:spacing w:val="14"/>
+          <w:sz w:val="28"/>
+        </w:rPr>
+        <w:t>/10-</w:t>
+      </w:r>
+      <w:r>
+        <w:rPr>
+          <w:color w:val="585858"/>
+          <w:spacing w:val="7"/>
+          <w:sz w:val="28"/>
+        </w:rPr>
+        <w:t>26</w:t>
+      </w:r>
+      <w:r>
+        <w:rPr>
+          <w:color w:val="585858"/>
+          <w:spacing w:val="7"/>
+          <w:sz w:val="28"/>
+        </w:rPr>
+        <w:t>/10</w:t>
+      </w:r>
+    </w:p>
+    <w:p>
+      <w:pPr>
+        <w:ind w:left="47" w:right="135"/>
+        <w:jc w:val="both"/>
+        <w:rPr>
+          <w:color w:val="585858"/>
+          <w:spacing w:val="13"/>
+          <w:sz w:val="28"/>
+        </w:rPr>
+      </w:pPr>
+      <w:r>
+        <w:rPr>
+          <w:color w:val="585858"/>
+          <w:spacing w:val="13"/>
+          <w:sz w:val="28"/>
+        </w:rPr>
+        <w:t>(Planificación: análisis del consumo eléctrico)</w:t>
+      </w:r>
+    </w:p>
+    <w:p>
+      <w:pPr>
+        <w:ind w:left="47" w:right="135"/>
+        <w:jc w:val="both"/>
+        <w:rPr>
+          <w:color w:val="585858"/>
+          <w:spacing w:val="13"/>
+          <w:sz w:val="28"/>
+        </w:rPr>
+      </w:pPr>
+    </w:p>
+    <w:p>
+      <w:pPr>
+        <w:jc w:val="both"/>
+      </w:pPr>
     </w:p>
     <w:sectPr>
       <w:pgSz w:w="11910" w:h="16840"/>
@@ -5734,7 +5711,7 @@
 </file>
 
 <file path=word/endnotes.xml><?xml version="1.0" encoding="utf-8"?>
-<w:endnotes xmlns:wpc="http://schemas.microsoft.com/office/word/2010/wordprocessingCanvas" xmlns:mc="http://schemas.openxmlformats.org/markup-compatibility/2006" xmlns:o="urn:schemas-microsoft-com:office:office" xmlns:r="http://schemas.openxmlformats.org/officeDocument/2006/relationships" xmlns:m="http://schemas.openxmlformats.org/officeDocument/2006/math" xmlns:v="urn:schemas-microsoft-com:vml" xmlns:wp14="http://schemas.microsoft.com/office/word/2010/wordprocessingDrawing" xmlns:wp="http://schemas.openxmlformats.org/drawingml/2006/wordprocessingDrawing" xmlns:w10="urn:schemas-microsoft-com:office:word" xmlns:w="http://schemas.openxmlformats.org/wordprocessingml/2006/main" xmlns:w14="http://schemas.microsoft.com/office/word/2010/wordml" xmlns:w15="http://schemas.microsoft.com/office/word/2012/wordml" xmlns:wpg="http://schemas.microsoft.com/office/word/2010/wordprocessingGroup" xmlns:wpi="http://schemas.microsoft.com/office/word/2010/wordprocessingInk" xmlns:wne="http://schemas.microsoft.com/office/word/2006/wordml" xmlns:wps="http://schemas.microsoft.com/office/word/2010/wordprocessingShape" mc:Ignorable="w14 w15 wp14">
+<w:endnotes xmlns:wpc="http://schemas.microsoft.com/office/word/2010/wordprocessingCanvas" xmlns:cx="http://schemas.microsoft.com/office/drawing/2014/chartex" xmlns:cx1="http://schemas.microsoft.com/office/drawing/2015/9/8/chartex" xmlns:cx2="http://schemas.microsoft.com/office/drawing/2015/10/21/chartex" xmlns:cx3="http://schemas.microsoft.com/office/drawing/2016/5/9/chartex" xmlns:cx4="http://schemas.microsoft.com/office/drawing/2016/5/10/chartex" xmlns:cx5="http://schemas.microsoft.com/office/drawing/2016/5/11/chartex" xmlns:cx6="http://schemas.microsoft.com/office/drawing/2016/5/12/chartex" xmlns:cx7="http://schemas.microsoft.com/office/drawing/2016/5/13/chartex" xmlns:cx8="http://schemas.microsoft.com/office/drawing/2016/5/14/chartex" xmlns:mc="http://schemas.openxmlformats.org/markup-compatibility/2006" xmlns:aink="http://schemas.microsoft.com/office/drawing/2016/ink" xmlns:am3d="http://schemas.microsoft.com/office/drawing/2017/model3d" xmlns:o="urn:schemas-microsoft-com:office:office" xmlns:oel="http://schemas.microsoft.com/office/2019/extlst" xmlns:r="http://schemas.openxmlformats.org/officeDocument/2006/relationships" xmlns:m="http://schemas.openxmlformats.org/officeDocument/2006/math" xmlns:v="urn:schemas-microsoft-com:vml" xmlns:wp14="http://schemas.microsoft.com/office/word/2010/wordprocessingDrawing" xmlns:wp="http://schemas.openxmlformats.org/drawingml/2006/wordprocessingDrawing" xmlns:w10="urn:schemas-microsoft-com:office:word" xmlns:w="http://schemas.openxmlformats.org/wordprocessingml/2006/main" xmlns:w14="http://schemas.microsoft.com/office/word/2010/wordml" xmlns:w15="http://schemas.microsoft.com/office/word/2012/wordml" xmlns:w16cex="http://schemas.microsoft.com/office/word/2018/wordml/cex" xmlns:w16cid="http://schemas.microsoft.com/office/word/2016/wordml/cid" xmlns:w16="http://schemas.microsoft.com/office/word/2018/wordml" xmlns:w16du="http://schemas.microsoft.com/office/word/2023/wordml/word16du" xmlns:w16sdtdh="http://schemas.microsoft.com/office/word/2020/wordml/sdtdatahash" xmlns:w16sdtfl="http://schemas.microsoft.com/office/word/2024/wordml/sdtformatlock" xmlns:w16se="http://schemas.microsoft.com/office/word/2015/wordml/symex" xmlns:wpg="http://schemas.microsoft.com/office/word/2010/wordprocessingGroup" xmlns:wpi="http://schemas.microsoft.com/office/word/2010/wordprocessingInk" xmlns:wne="http://schemas.microsoft.com/office/word/2006/wordml" xmlns:wps="http://schemas.microsoft.com/office/word/2010/wordprocessingShape" mc:Ignorable="w14 w15 w16se w16cid w16 w16cex w16sdtdh w16sdtfl w16du wp14">
   <w:endnote w:type="separator" w:id="-1">
     <w:p>
       <w:r>
@@ -5753,7 +5730,7 @@
 </file>
 
 <file path=word/footer1.xml><?xml version="1.0" encoding="utf-8"?>
-<w:ftr xmlns:wpc="http://schemas.microsoft.com/office/word/2010/wordprocessingCanvas" xmlns:mc="http://schemas.openxmlformats.org/markup-compatibility/2006" xmlns:o="urn:schemas-microsoft-com:office:office" xmlns:r="http://schemas.openxmlformats.org/officeDocument/2006/relationships" xmlns:m="http://schemas.openxmlformats.org/officeDocument/2006/math" xmlns:v="urn:schemas-microsoft-com:vml" xmlns:wp14="http://schemas.microsoft.com/office/word/2010/wordprocessingDrawing" xmlns:wp="http://schemas.openxmlformats.org/drawingml/2006/wordprocessingDrawing" xmlns:w10="urn:schemas-microsoft-com:office:word" xmlns:w="http://schemas.openxmlformats.org/wordprocessingml/2006/main" xmlns:w14="http://schemas.microsoft.com/office/word/2010/wordml" xmlns:w15="http://schemas.microsoft.com/office/word/2012/wordml" xmlns:wpg="http://schemas.microsoft.com/office/word/2010/wordprocessingGroup" xmlns:wpi="http://schemas.microsoft.com/office/word/2010/wordprocessingInk" xmlns:wne="http://schemas.microsoft.com/office/word/2006/wordml" xmlns:wps="http://schemas.microsoft.com/office/word/2010/wordprocessingShape" mc:Ignorable="w14 w15 wp14">
+<w:ftr xmlns:wpc="http://schemas.microsoft.com/office/word/2010/wordprocessingCanvas" xmlns:cx="http://schemas.microsoft.com/office/drawing/2014/chartex" xmlns:cx1="http://schemas.microsoft.com/office/drawing/2015/9/8/chartex" xmlns:cx2="http://schemas.microsoft.com/office/drawing/2015/10/21/chartex" xmlns:cx3="http://schemas.microsoft.com/office/drawing/2016/5/9/chartex" xmlns:cx4="http://schemas.microsoft.com/office/drawing/2016/5/10/chartex" xmlns:cx5="http://schemas.microsoft.com/office/drawing/2016/5/11/chartex" xmlns:cx6="http://schemas.microsoft.com/office/drawing/2016/5/12/chartex" xmlns:cx7="http://schemas.microsoft.com/office/drawing/2016/5/13/chartex" xmlns:cx8="http://schemas.microsoft.com/office/drawing/2016/5/14/chartex" xmlns:mc="http://schemas.openxmlformats.org/markup-compatibility/2006" xmlns:aink="http://schemas.microsoft.com/office/drawing/2016/ink" xmlns:am3d="http://schemas.microsoft.com/office/drawing/2017/model3d" xmlns:o="urn:schemas-microsoft-com:office:office" xmlns:oel="http://schemas.microsoft.com/office/2019/extlst" xmlns:r="http://schemas.openxmlformats.org/officeDocument/2006/relationships" xmlns:m="http://schemas.openxmlformats.org/officeDocument/2006/math" xmlns:v="urn:schemas-microsoft-com:vml" xmlns:wp14="http://schemas.microsoft.com/office/word/2010/wordprocessingDrawing" xmlns:wp="http://schemas.openxmlformats.org/drawingml/2006/wordprocessingDrawing" xmlns:w10="urn:schemas-microsoft-com:office:word" xmlns:w="http://schemas.openxmlformats.org/wordprocessingml/2006/main" xmlns:w14="http://schemas.microsoft.com/office/word/2010/wordml" xmlns:w15="http://schemas.microsoft.com/office/word/2012/wordml" xmlns:w16cex="http://schemas.microsoft.com/office/word/2018/wordml/cex" xmlns:w16cid="http://schemas.microsoft.com/office/word/2016/wordml/cid" xmlns:w16="http://schemas.microsoft.com/office/word/2018/wordml" xmlns:w16du="http://schemas.microsoft.com/office/word/2023/wordml/word16du" xmlns:w16sdtdh="http://schemas.microsoft.com/office/word/2020/wordml/sdtdatahash" xmlns:w16sdtfl="http://schemas.microsoft.com/office/word/2024/wordml/sdtformatlock" xmlns:w16se="http://schemas.microsoft.com/office/word/2015/wordml/symex" xmlns:wpg="http://schemas.microsoft.com/office/word/2010/wordprocessingGroup" xmlns:wpi="http://schemas.microsoft.com/office/word/2010/wordprocessingInk" xmlns:wne="http://schemas.microsoft.com/office/word/2006/wordml" xmlns:wps="http://schemas.microsoft.com/office/word/2010/wordprocessingShape" mc:Ignorable="w14 w15 w16se w16cid w16 w16cex w16sdtdh w16sdtfl w16du wp14">
   <w:p>
     <w:pPr>
       <w:pStyle w:val="Textoindependiente"/>
@@ -5858,8 +5835,7 @@
               <v:stroke joinstyle="miter"/>
               <v:path gradientshapeok="t" o:connecttype="rect"/>
             </v:shapetype>
-            <v:shape id="Textbox 3" o:spid="_x0000_s1027" type="#_x0000_t202" style="position:absolute;margin-left:501.2pt;margin-top:780.5pt;width:13.15pt;height:14.35pt;z-index:-15872000;visibility:visible;mso-wrap-style:square;mso-wrap-distance-left:0;mso-wrap-distance-top:0;mso-wrap-distance-right:0;mso-wrap-distance-bottom:0;mso-position-horizontal:absolute;mso-position-horizontal-relative:page;mso-position-vertical:absolute;mso-position-vertical-relative:page;v-text-anchor:top" o:gfxdata="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" filled="f" stroked="f">
-              <v:path arrowok="t"/>
+            <v:shape id="Textbox 3" o:spid="_x0000_s1027" type="#_x0000_t202" style="position:absolute;margin-left:501.2pt;margin-top:780.5pt;width:13.15pt;height:14.35pt;z-index:-15872000;visibility:visible;mso-wrap-style:square;mso-wrap-distance-left:0;mso-wrap-distance-top:0;mso-wrap-distance-right:0;mso-wrap-distance-bottom:0;mso-position-horizontal:absolute;mso-position-horizontal-relative:page;mso-position-vertical:absolute;mso-position-vertical-relative:page;v-text-anchor:top" o:gfxdata="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" filled="f" stroked="f">
               <v:textbox inset="0,0,0,0">
                 <w:txbxContent>
                   <w:p>
@@ -5913,7 +5889,7 @@
 </file>
 
 <file path=word/footnotes.xml><?xml version="1.0" encoding="utf-8"?>
-<w:footnotes xmlns:wpc="http://schemas.microsoft.com/office/word/2010/wordprocessingCanvas" xmlns:mc="http://schemas.openxmlformats.org/markup-compatibility/2006" xmlns:o="urn:schemas-microsoft-com:office:office" xmlns:r="http://schemas.openxmlformats.org/officeDocument/2006/relationships" xmlns:m="http://schemas.openxmlformats.org/officeDocument/2006/math" xmlns:v="urn:schemas-microsoft-com:vml" xmlns:wp14="http://schemas.microsoft.com/office/word/2010/wordprocessingDrawing" xmlns:wp="http://schemas.openxmlformats.org/drawingml/2006/wordprocessingDrawing" xmlns:w10="urn:schemas-microsoft-com:office:word" xmlns:w="http://schemas.openxmlformats.org/wordprocessingml/2006/main" xmlns:w14="http://schemas.microsoft.com/office/word/2010/wordml" xmlns:w15="http://schemas.microsoft.com/office/word/2012/wordml" xmlns:wpg="http://schemas.microsoft.com/office/word/2010/wordprocessingGroup" xmlns:wpi="http://schemas.microsoft.com/office/word/2010/wordprocessingInk" xmlns:wne="http://schemas.microsoft.com/office/word/2006/wordml" xmlns:wps="http://schemas.microsoft.com/office/word/2010/wordprocessingShape" mc:Ignorable="w14 w15 wp14">
+<w:footnotes xmlns:wpc="http://schemas.microsoft.com/office/word/2010/wordprocessingCanvas" xmlns:cx="http://schemas.microsoft.com/office/drawing/2014/chartex" xmlns:cx1="http://schemas.microsoft.com/office/drawing/2015/9/8/chartex" xmlns:cx2="http://schemas.microsoft.com/office/drawing/2015/10/21/chartex" xmlns:cx3="http://schemas.microsoft.com/office/drawing/2016/5/9/chartex" xmlns:cx4="http://schemas.microsoft.com/office/drawing/2016/5/10/chartex" xmlns:cx5="http://schemas.microsoft.com/office/drawing/2016/5/11/chartex" xmlns:cx6="http://schemas.microsoft.com/office/drawing/2016/5/12/chartex" xmlns:cx7="http://schemas.microsoft.com/office/drawing/2016/5/13/chartex" xmlns:cx8="http://schemas.microsoft.com/office/drawing/2016/5/14/chartex" xmlns:mc="http://schemas.openxmlformats.org/markup-compatibility/2006" xmlns:aink="http://schemas.microsoft.com/office/drawing/2016/ink" xmlns:am3d="http://schemas.microsoft.com/office/drawing/2017/model3d" xmlns:o="urn:schemas-microsoft-com:office:office" xmlns:oel="http://schemas.microsoft.com/office/2019/extlst" xmlns:r="http://schemas.openxmlformats.org/officeDocument/2006/relationships" xmlns:m="http://schemas.openxmlformats.org/officeDocument/2006/math" xmlns:v="urn:schemas-microsoft-com:vml" xmlns:wp14="http://schemas.microsoft.com/office/word/2010/wordprocessingDrawing" xmlns:wp="http://schemas.openxmlformats.org/drawingml/2006/wordprocessingDrawing" xmlns:w10="urn:schemas-microsoft-com:office:word" xmlns:w="http://schemas.openxmlformats.org/wordprocessingml/2006/main" xmlns:w14="http://schemas.microsoft.com/office/word/2010/wordml" xmlns:w15="http://schemas.microsoft.com/office/word/2012/wordml" xmlns:w16cex="http://schemas.microsoft.com/office/word/2018/wordml/cex" xmlns:w16cid="http://schemas.microsoft.com/office/word/2016/wordml/cid" xmlns:w16="http://schemas.microsoft.com/office/word/2018/wordml" xmlns:w16du="http://schemas.microsoft.com/office/word/2023/wordml/word16du" xmlns:w16sdtdh="http://schemas.microsoft.com/office/word/2020/wordml/sdtdatahash" xmlns:w16sdtfl="http://schemas.microsoft.com/office/word/2024/wordml/sdtformatlock" xmlns:w16se="http://schemas.microsoft.com/office/word/2015/wordml/symex" xmlns:wpg="http://schemas.microsoft.com/office/word/2010/wordprocessingGroup" xmlns:wpi="http://schemas.microsoft.com/office/word/2010/wordprocessingInk" xmlns:wne="http://schemas.microsoft.com/office/word/2006/wordml" xmlns:wps="http://schemas.microsoft.com/office/word/2010/wordprocessingShape" mc:Ignorable="w14 w15 w16se w16cid w16 w16cex w16sdtdh w16sdtfl w16du wp14">
   <w:footnote w:type="separator" w:id="-1">
     <w:p>
       <w:r>
@@ -5932,7 +5908,7 @@
 </file>
 
 <file path=word/header1.xml><?xml version="1.0" encoding="utf-8"?>
-<w:hdr xmlns:wpc="http://schemas.microsoft.com/office/word/2010/wordprocessingCanvas" xmlns:mc="http://schemas.openxmlformats.org/markup-compatibility/2006" xmlns:o="urn:schemas-microsoft-com:office:office" xmlns:r="http://schemas.openxmlformats.org/officeDocument/2006/relationships" xmlns:m="http://schemas.openxmlformats.org/officeDocument/2006/math" xmlns:v="urn:schemas-microsoft-com:vml" xmlns:wp14="http://schemas.microsoft.com/office/word/2010/wordprocessingDrawing" xmlns:wp="http://schemas.openxmlformats.org/drawingml/2006/wordprocessingDrawing" xmlns:w10="urn:schemas-microsoft-com:office:word" xmlns:w="http://schemas.openxmlformats.org/wordprocessingml/2006/main" xmlns:w14="http://schemas.microsoft.com/office/word/2010/wordml" xmlns:w15="http://schemas.microsoft.com/office/word/2012/wordml" xmlns:wpg="http://schemas.microsoft.com/office/word/2010/wordprocessingGroup" xmlns:wpi="http://schemas.microsoft.com/office/word/2010/wordprocessingInk" xmlns:wne="http://schemas.microsoft.com/office/word/2006/wordml" xmlns:wps="http://schemas.microsoft.com/office/word/2010/wordprocessingShape" mc:Ignorable="w14 w15 wp14">
+<w:hdr xmlns:wpc="http://schemas.microsoft.com/office/word/2010/wordprocessingCanvas" xmlns:cx="http://schemas.microsoft.com/office/drawing/2014/chartex" xmlns:cx1="http://schemas.microsoft.com/office/drawing/2015/9/8/chartex" xmlns:cx2="http://schemas.microsoft.com/office/drawing/2015/10/21/chartex" xmlns:cx3="http://schemas.microsoft.com/office/drawing/2016/5/9/chartex" xmlns:cx4="http://schemas.microsoft.com/office/drawing/2016/5/10/chartex" xmlns:cx5="http://schemas.microsoft.com/office/drawing/2016/5/11/chartex" xmlns:cx6="http://schemas.microsoft.com/office/drawing/2016/5/12/chartex" xmlns:cx7="http://schemas.microsoft.com/office/drawing/2016/5/13/chartex" xmlns:cx8="http://schemas.microsoft.com/office/drawing/2016/5/14/chartex" xmlns:mc="http://schemas.openxmlformats.org/markup-compatibility/2006" xmlns:aink="http://schemas.microsoft.com/office/drawing/2016/ink" xmlns:am3d="http://schemas.microsoft.com/office/drawing/2017/model3d" xmlns:o="urn:schemas-microsoft-com:office:office" xmlns:oel="http://schemas.microsoft.com/office/2019/extlst" xmlns:r="http://schemas.openxmlformats.org/officeDocument/2006/relationships" xmlns:m="http://schemas.openxmlformats.org/officeDocument/2006/math" xmlns:v="urn:schemas-microsoft-com:vml" xmlns:wp14="http://schemas.microsoft.com/office/word/2010/wordprocessingDrawing" xmlns:wp="http://schemas.openxmlformats.org/drawingml/2006/wordprocessingDrawing" xmlns:w10="urn:schemas-microsoft-com:office:word" xmlns:w="http://schemas.openxmlformats.org/wordprocessingml/2006/main" xmlns:w14="http://schemas.microsoft.com/office/word/2010/wordml" xmlns:w15="http://schemas.microsoft.com/office/word/2012/wordml" xmlns:w16cex="http://schemas.microsoft.com/office/word/2018/wordml/cex" xmlns:w16cid="http://schemas.microsoft.com/office/word/2016/wordml/cid" xmlns:w16="http://schemas.microsoft.com/office/word/2018/wordml" xmlns:w16du="http://schemas.microsoft.com/office/word/2023/wordml/word16du" xmlns:w16sdtdh="http://schemas.microsoft.com/office/word/2020/wordml/sdtdatahash" xmlns:w16sdtfl="http://schemas.microsoft.com/office/word/2024/wordml/sdtformatlock" xmlns:w16se="http://schemas.microsoft.com/office/word/2015/wordml/symex" xmlns:wpg="http://schemas.microsoft.com/office/word/2010/wordprocessingGroup" xmlns:wpi="http://schemas.microsoft.com/office/word/2010/wordprocessingInk" xmlns:wne="http://schemas.microsoft.com/office/word/2006/wordml" xmlns:wps="http://schemas.microsoft.com/office/word/2010/wordprocessingShape" mc:Ignorable="w14 w15 w16se w16cid w16 w16cex w16sdtdh w16sdtfl w16du wp14">
   <w:p>
     <w:pPr>
       <w:pStyle w:val="Textoindependiente"/>
@@ -6084,8 +6060,7 @@
               <v:stroke joinstyle="miter"/>
               <v:path gradientshapeok="t" o:connecttype="rect"/>
             </v:shapetype>
-            <v:shape id="Textbox 2" o:spid="_x0000_s1026" type="#_x0000_t202" style="position:absolute;margin-left:84.1pt;margin-top:34.6pt;width:267.25pt;height:14.35pt;z-index:-15872512;visibility:visible;mso-wrap-style:square;mso-wrap-distance-left:0;mso-wrap-distance-top:0;mso-wrap-distance-right:0;mso-wrap-distance-bottom:0;mso-position-horizontal:absolute;mso-position-horizontal-relative:page;mso-position-vertical:absolute;mso-position-vertical-relative:page;v-text-anchor:top" o:gfxdata="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" filled="f" stroked="f">
-              <v:path arrowok="t"/>
+            <v:shape id="Textbox 2" o:spid="_x0000_s1026" type="#_x0000_t202" style="position:absolute;margin-left:84.1pt;margin-top:34.6pt;width:267.25pt;height:14.35pt;z-index:-15872512;visibility:visible;mso-wrap-style:square;mso-wrap-distance-left:0;mso-wrap-distance-top:0;mso-wrap-distance-right:0;mso-wrap-distance-bottom:0;mso-position-horizontal:absolute;mso-position-horizontal-relative:page;mso-position-vertical:absolute;mso-position-vertical-relative:page;v-text-anchor:top" o:gfxdata="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" filled="f" stroked="f">
               <v:textbox inset="0,0,0,0">
                 <w:txbxContent>
                   <w:p>
@@ -6186,7 +6161,7 @@
 </file>
 
 <file path=word/styles.xml><?xml version="1.0" encoding="utf-8"?>
-<w:styles xmlns:mc="http://schemas.openxmlformats.org/markup-compatibility/2006" xmlns:r="http://schemas.openxmlformats.org/officeDocument/2006/relationships" xmlns:w="http://schemas.openxmlformats.org/wordprocessingml/2006/main" xmlns:w14="http://schemas.microsoft.com/office/word/2010/wordml" xmlns:w15="http://schemas.microsoft.com/office/word/2012/wordml" mc:Ignorable="w14 w15">
+<w:styles xmlns:mc="http://schemas.openxmlformats.org/markup-compatibility/2006" xmlns:r="http://schemas.openxmlformats.org/officeDocument/2006/relationships" xmlns:w="http://schemas.openxmlformats.org/wordprocessingml/2006/main" xmlns:w14="http://schemas.microsoft.com/office/word/2010/wordml" xmlns:w15="http://schemas.microsoft.com/office/word/2012/wordml" xmlns:w16cex="http://schemas.microsoft.com/office/word/2018/wordml/cex" xmlns:w16cid="http://schemas.microsoft.com/office/word/2016/wordml/cid" xmlns:w16="http://schemas.microsoft.com/office/word/2018/wordml" xmlns:w16du="http://schemas.microsoft.com/office/word/2023/wordml/word16du" xmlns:w16sdtdh="http://schemas.microsoft.com/office/word/2020/wordml/sdtdatahash" xmlns:w16sdtfl="http://schemas.microsoft.com/office/word/2024/wordml/sdtformatlock" xmlns:w16se="http://schemas.microsoft.com/office/word/2015/wordml/symex" mc:Ignorable="w14 w15 w16se w16cid w16 w16cex w16sdtdh w16sdtfl w16du">
   <w:docDefaults>
     <w:rPrDefault>
       <w:rPr>
@@ -6204,7 +6179,7 @@
       </w:pPr>
     </w:pPrDefault>
   </w:docDefaults>
-  <w:latentStyles w:defLockedState="0" w:defUIPriority="99" w:defSemiHidden="0" w:defUnhideWhenUsed="0" w:defQFormat="0" w:count="371">
+  <w:latentStyles w:defLockedState="0" w:defUIPriority="99" w:defSemiHidden="0" w:defUnhideWhenUsed="0" w:defQFormat="0" w:count="376">
     <w:lsdException w:name="Normal" w:uiPriority="0" w:qFormat="1"/>
     <w:lsdException w:name="heading 1" w:uiPriority="9" w:qFormat="1"/>
     <w:lsdException w:name="heading 2" w:semiHidden="1" w:uiPriority="9" w:unhideWhenUsed="1" w:qFormat="1"/>
@@ -6576,11 +6551,16 @@
     <w:lsdException w:name="List Table 5 Dark Accent 6" w:uiPriority="50"/>
     <w:lsdException w:name="List Table 6 Colorful Accent 6" w:uiPriority="51"/>
     <w:lsdException w:name="List Table 7 Colorful Accent 6" w:uiPriority="52"/>
+    <w:lsdException w:name="Mention" w:semiHidden="1" w:unhideWhenUsed="1"/>
+    <w:lsdException w:name="Smart Hyperlink" w:semiHidden="1" w:unhideWhenUsed="1"/>
+    <w:lsdException w:name="Hashtag" w:semiHidden="1" w:unhideWhenUsed="1"/>
+    <w:lsdException w:name="Unresolved Mention" w:semiHidden="1" w:unhideWhenUsed="1"/>
+    <w:lsdException w:name="Smart Link" w:semiHidden="1" w:unhideWhenUsed="1"/>
   </w:latentStyles>
   <w:style w:type="paragraph" w:default="1" w:styleId="Normal">
     <w:name w:val="Normal"/>
     <w:qFormat/>
-    <w:rsid w:val="00A90DF6"/>
+    <w:rsid w:val="006245BF"/>
     <w:rPr>
       <w:rFonts w:ascii="Arial MT" w:eastAsia="Arial MT" w:hAnsi="Arial MT" w:cs="Arial MT"/>
       <w:lang w:val="es-ES"/>
@@ -6635,7 +6615,7 @@
     <w:uiPriority w:val="1"/>
     <w:qFormat/>
   </w:style>
-  <w:style w:type="paragraph" w:styleId="Puesto">
+  <w:style w:type="paragraph" w:styleId="Ttulo">
     <w:name w:val="Title"/>
     <w:basedOn w:val="Normal"/>
     <w:uiPriority w:val="10"/>

</xml_diff>

<commit_message>
actualizado word y pdf planificacion
</commit_message>
<xml_diff>
--- a/Planificacion/Words/G1_PLANIFICACIÓN_ SEGUIMIENTO_CALIDAD.docx
+++ b/Planificacion/Words/G1_PLANIFICACIÓN_ SEGUIMIENTO_CALIDAD.docx
@@ -1,10 +1,10 @@
 
 <file path=word/document.xml><?xml version="1.0" encoding="utf-8"?>
-<w:document xmlns:wpc="http://schemas.microsoft.com/office/word/2010/wordprocessingCanvas" xmlns:mc="http://schemas.openxmlformats.org/markup-compatibility/2006" xmlns:o="urn:schemas-microsoft-com:office:office" xmlns:r="http://schemas.openxmlformats.org/officeDocument/2006/relationships" xmlns:m="http://schemas.openxmlformats.org/officeDocument/2006/math" xmlns:v="urn:schemas-microsoft-com:vml" xmlns:wp14="http://schemas.microsoft.com/office/word/2010/wordprocessingDrawing" xmlns:wp="http://schemas.openxmlformats.org/drawingml/2006/wordprocessingDrawing" xmlns:w10="urn:schemas-microsoft-com:office:word" xmlns:w="http://schemas.openxmlformats.org/wordprocessingml/2006/main" xmlns:w14="http://schemas.microsoft.com/office/word/2010/wordml" xmlns:w15="http://schemas.microsoft.com/office/word/2012/wordml" xmlns:wpg="http://schemas.microsoft.com/office/word/2010/wordprocessingGroup" xmlns:wpi="http://schemas.microsoft.com/office/word/2010/wordprocessingInk" xmlns:wne="http://schemas.microsoft.com/office/word/2006/wordml" xmlns:wps="http://schemas.microsoft.com/office/word/2010/wordprocessingShape" mc:Ignorable="w14 w15 wp14">
+<w:document xmlns:wpc="http://schemas.microsoft.com/office/word/2010/wordprocessingCanvas" xmlns:cx="http://schemas.microsoft.com/office/drawing/2014/chartex" xmlns:cx1="http://schemas.microsoft.com/office/drawing/2015/9/8/chartex" xmlns:cx2="http://schemas.microsoft.com/office/drawing/2015/10/21/chartex" xmlns:cx3="http://schemas.microsoft.com/office/drawing/2016/5/9/chartex" xmlns:cx4="http://schemas.microsoft.com/office/drawing/2016/5/10/chartex" xmlns:cx5="http://schemas.microsoft.com/office/drawing/2016/5/11/chartex" xmlns:cx6="http://schemas.microsoft.com/office/drawing/2016/5/12/chartex" xmlns:cx7="http://schemas.microsoft.com/office/drawing/2016/5/13/chartex" xmlns:cx8="http://schemas.microsoft.com/office/drawing/2016/5/14/chartex" xmlns:mc="http://schemas.openxmlformats.org/markup-compatibility/2006" xmlns:aink="http://schemas.microsoft.com/office/drawing/2016/ink" xmlns:am3d="http://schemas.microsoft.com/office/drawing/2017/model3d" xmlns:o="urn:schemas-microsoft-com:office:office" xmlns:oel="http://schemas.microsoft.com/office/2019/extlst" xmlns:r="http://schemas.openxmlformats.org/officeDocument/2006/relationships" xmlns:m="http://schemas.openxmlformats.org/officeDocument/2006/math" xmlns:v="urn:schemas-microsoft-com:vml" xmlns:wp14="http://schemas.microsoft.com/office/word/2010/wordprocessingDrawing" xmlns:wp="http://schemas.openxmlformats.org/drawingml/2006/wordprocessingDrawing" xmlns:w10="urn:schemas-microsoft-com:office:word" xmlns:w="http://schemas.openxmlformats.org/wordprocessingml/2006/main" xmlns:w14="http://schemas.microsoft.com/office/word/2010/wordml" xmlns:w15="http://schemas.microsoft.com/office/word/2012/wordml" xmlns:w16cex="http://schemas.microsoft.com/office/word/2018/wordml/cex" xmlns:w16cid="http://schemas.microsoft.com/office/word/2016/wordml/cid" xmlns:w16="http://schemas.microsoft.com/office/word/2018/wordml" xmlns:w16du="http://schemas.microsoft.com/office/word/2023/wordml/word16du" xmlns:w16sdtdh="http://schemas.microsoft.com/office/word/2020/wordml/sdtdatahash" xmlns:w16sdtfl="http://schemas.microsoft.com/office/word/2024/wordml/sdtformatlock" xmlns:w16se="http://schemas.microsoft.com/office/word/2015/wordml/symex" xmlns:wpg="http://schemas.microsoft.com/office/word/2010/wordprocessingGroup" xmlns:wpi="http://schemas.microsoft.com/office/word/2010/wordprocessingInk" xmlns:wne="http://schemas.microsoft.com/office/word/2006/wordml" xmlns:wps="http://schemas.microsoft.com/office/word/2010/wordprocessingShape" mc:Ignorable="w14 w15 w16se w16cid w16 w16cex w16sdtdh w16sdtfl w16du wp14">
   <w:body>
     <w:p>
       <w:pPr>
-        <w:pStyle w:val="Puesto"/>
+        <w:pStyle w:val="Ttulo"/>
       </w:pPr>
       <w:r>
         <w:t>Plan</w:t>
@@ -5595,7 +5595,7 @@
           <v:shape id="_x0000_i1025" type="#_x0000_t75" style="width:193.5pt;height:273pt" o:ole="">
             <v:imagedata r:id="rId17" o:title=""/>
           </v:shape>
-          <o:OLEObject Type="Embed" ProgID="Acrobat.Document.DC" ShapeID="_x0000_i1025" DrawAspect="Content" ObjectID="_1825838845" r:id="rId18"/>
+          <o:OLEObject Type="Embed" ProgID="Acrobat.Document.DC" ShapeID="_x0000_i1025" DrawAspect="Content" ObjectID="_1826803438" r:id="rId18"/>
         </w:object>
       </w:r>
     </w:p>
@@ -5640,7 +5640,7 @@
           <v:shape id="_x0000_i1026" type="#_x0000_t75" style="width:477pt;height:149.25pt" o:ole="">
             <v:imagedata r:id="rId19" o:title=""/>
           </v:shape>
-          <o:OLEObject Type="Embed" ProgID="Excel.Sheet.12" ShapeID="_x0000_i1026" DrawAspect="Content" ObjectID="_1825838846" r:id="rId20"/>
+          <o:OLEObject Type="Embed" ProgID="Excel.Sheet.12" ShapeID="_x0000_i1026" DrawAspect="Content" ObjectID="_1826803439" r:id="rId20"/>
         </w:object>
       </w:r>
     </w:p>
@@ -6494,15 +6494,7 @@
           <w:spacing w:val="14"/>
           <w:sz w:val="28"/>
         </w:rPr>
-        <w:t>24</w:t>
-      </w:r>
-      <w:r>
-        <w:rPr>
-          <w:color w:val="585858"/>
-          <w:spacing w:val="14"/>
-          <w:sz w:val="28"/>
-        </w:rPr>
-        <w:t>/11-</w:t>
+        <w:t>24/11-</w:t>
       </w:r>
       <w:r>
         <w:rPr>
@@ -6510,15 +6502,7 @@
           <w:spacing w:val="7"/>
           <w:sz w:val="28"/>
         </w:rPr>
-        <w:t>30</w:t>
-      </w:r>
-      <w:r>
-        <w:rPr>
-          <w:color w:val="585858"/>
-          <w:spacing w:val="7"/>
-          <w:sz w:val="28"/>
-        </w:rPr>
-        <w:t>/11</w:t>
+        <w:t>30/11</w:t>
       </w:r>
     </w:p>
     <w:p>
@@ -6565,8 +6549,105 @@
         </w:rPr>
         <w:t>Como observaciones aclarar que la PCB3 ya se ha fabricado y que a día 28 se encuentra en envío.</w:t>
       </w:r>
-      <w:bookmarkStart w:id="2" w:name="_GoBack"/>
-      <w:bookmarkEnd w:id="2"/>
+    </w:p>
+    <w:p>
+      <w:pPr>
+        <w:spacing w:before="156"/>
+        <w:jc w:val="both"/>
+        <w:rPr>
+          <w:color w:val="585858"/>
+          <w:spacing w:val="7"/>
+          <w:sz w:val="28"/>
+        </w:rPr>
+      </w:pPr>
+      <w:r>
+        <w:rPr>
+          <w:color w:val="585858"/>
+          <w:spacing w:val="11"/>
+          <w:sz w:val="28"/>
+        </w:rPr>
+        <w:t>Semana</w:t>
+      </w:r>
+      <w:r>
+        <w:rPr>
+          <w:color w:val="585858"/>
+          <w:spacing w:val="35"/>
+          <w:sz w:val="28"/>
+        </w:rPr>
+        <w:t xml:space="preserve"> </w:t>
+      </w:r>
+      <w:r>
+        <w:rPr>
+          <w:color w:val="585858"/>
+          <w:spacing w:val="14"/>
+          <w:sz w:val="28"/>
+        </w:rPr>
+        <w:t>01</w:t>
+      </w:r>
+      <w:r>
+        <w:rPr>
+          <w:color w:val="585858"/>
+          <w:spacing w:val="14"/>
+          <w:sz w:val="28"/>
+        </w:rPr>
+        <w:t>/1</w:t>
+      </w:r>
+      <w:r>
+        <w:rPr>
+          <w:color w:val="585858"/>
+          <w:spacing w:val="14"/>
+          <w:sz w:val="28"/>
+        </w:rPr>
+        <w:t>2</w:t>
+      </w:r>
+      <w:r>
+        <w:rPr>
+          <w:color w:val="585858"/>
+          <w:spacing w:val="14"/>
+          <w:sz w:val="28"/>
+        </w:rPr>
+        <w:t>-</w:t>
+      </w:r>
+      <w:r>
+        <w:rPr>
+          <w:color w:val="585858"/>
+          <w:spacing w:val="7"/>
+          <w:sz w:val="28"/>
+        </w:rPr>
+        <w:t>07</w:t>
+      </w:r>
+      <w:r>
+        <w:rPr>
+          <w:color w:val="585858"/>
+          <w:spacing w:val="7"/>
+          <w:sz w:val="28"/>
+        </w:rPr>
+        <w:t>/1</w:t>
+      </w:r>
+      <w:r>
+        <w:rPr>
+          <w:color w:val="585858"/>
+          <w:spacing w:val="7"/>
+          <w:sz w:val="28"/>
+        </w:rPr>
+        <w:t>2</w:t>
+      </w:r>
+    </w:p>
+    <w:p>
+      <w:pPr>
+        <w:spacing w:before="156"/>
+        <w:jc w:val="both"/>
+        <w:rPr>
+          <w:szCs w:val="16"/>
+        </w:rPr>
+      </w:pPr>
+      <w:r>
+        <w:t xml:space="preserve">En esta semana ambas sesiones se han estructurado de manera similar, en ellas nos </w:t>
+      </w:r>
+      <w:r>
+        <w:lastRenderedPageBreak/>
+        <w:t>hemos dividido en grupos de dos, Víctor y Mario, Miguel y Clara. Durante las sesiones, Víctor y Mario se han dedicado a soldar componentes a una de las PCBs, mientras que Clara y Miguel se han dedicado a la parte relacionada con LarVa, modificando los direccionamientos de memoria y aumentado esta.</w:t>
+      </w:r>
     </w:p>
     <w:sectPr>
       <w:pgSz w:w="11910" w:h="16840"/>
@@ -6578,7 +6659,7 @@
 </file>
 
 <file path=word/endnotes.xml><?xml version="1.0" encoding="utf-8"?>
-<w:endnotes xmlns:wpc="http://schemas.microsoft.com/office/word/2010/wordprocessingCanvas" xmlns:mc="http://schemas.openxmlformats.org/markup-compatibility/2006" xmlns:o="urn:schemas-microsoft-com:office:office" xmlns:r="http://schemas.openxmlformats.org/officeDocument/2006/relationships" xmlns:m="http://schemas.openxmlformats.org/officeDocument/2006/math" xmlns:v="urn:schemas-microsoft-com:vml" xmlns:wp14="http://schemas.microsoft.com/office/word/2010/wordprocessingDrawing" xmlns:wp="http://schemas.openxmlformats.org/drawingml/2006/wordprocessingDrawing" xmlns:w10="urn:schemas-microsoft-com:office:word" xmlns:w="http://schemas.openxmlformats.org/wordprocessingml/2006/main" xmlns:w14="http://schemas.microsoft.com/office/word/2010/wordml" xmlns:w15="http://schemas.microsoft.com/office/word/2012/wordml" xmlns:wpg="http://schemas.microsoft.com/office/word/2010/wordprocessingGroup" xmlns:wpi="http://schemas.microsoft.com/office/word/2010/wordprocessingInk" xmlns:wne="http://schemas.microsoft.com/office/word/2006/wordml" xmlns:wps="http://schemas.microsoft.com/office/word/2010/wordprocessingShape" mc:Ignorable="w14 w15 wp14">
+<w:endnotes xmlns:wpc="http://schemas.microsoft.com/office/word/2010/wordprocessingCanvas" xmlns:cx="http://schemas.microsoft.com/office/drawing/2014/chartex" xmlns:cx1="http://schemas.microsoft.com/office/drawing/2015/9/8/chartex" xmlns:cx2="http://schemas.microsoft.com/office/drawing/2015/10/21/chartex" xmlns:cx3="http://schemas.microsoft.com/office/drawing/2016/5/9/chartex" xmlns:cx4="http://schemas.microsoft.com/office/drawing/2016/5/10/chartex" xmlns:cx5="http://schemas.microsoft.com/office/drawing/2016/5/11/chartex" xmlns:cx6="http://schemas.microsoft.com/office/drawing/2016/5/12/chartex" xmlns:cx7="http://schemas.microsoft.com/office/drawing/2016/5/13/chartex" xmlns:cx8="http://schemas.microsoft.com/office/drawing/2016/5/14/chartex" xmlns:mc="http://schemas.openxmlformats.org/markup-compatibility/2006" xmlns:aink="http://schemas.microsoft.com/office/drawing/2016/ink" xmlns:am3d="http://schemas.microsoft.com/office/drawing/2017/model3d" xmlns:o="urn:schemas-microsoft-com:office:office" xmlns:oel="http://schemas.microsoft.com/office/2019/extlst" xmlns:r="http://schemas.openxmlformats.org/officeDocument/2006/relationships" xmlns:m="http://schemas.openxmlformats.org/officeDocument/2006/math" xmlns:v="urn:schemas-microsoft-com:vml" xmlns:wp14="http://schemas.microsoft.com/office/word/2010/wordprocessingDrawing" xmlns:wp="http://schemas.openxmlformats.org/drawingml/2006/wordprocessingDrawing" xmlns:w10="urn:schemas-microsoft-com:office:word" xmlns:w="http://schemas.openxmlformats.org/wordprocessingml/2006/main" xmlns:w14="http://schemas.microsoft.com/office/word/2010/wordml" xmlns:w15="http://schemas.microsoft.com/office/word/2012/wordml" xmlns:w16cex="http://schemas.microsoft.com/office/word/2018/wordml/cex" xmlns:w16cid="http://schemas.microsoft.com/office/word/2016/wordml/cid" xmlns:w16="http://schemas.microsoft.com/office/word/2018/wordml" xmlns:w16du="http://schemas.microsoft.com/office/word/2023/wordml/word16du" xmlns:w16sdtdh="http://schemas.microsoft.com/office/word/2020/wordml/sdtdatahash" xmlns:w16sdtfl="http://schemas.microsoft.com/office/word/2024/wordml/sdtformatlock" xmlns:w16se="http://schemas.microsoft.com/office/word/2015/wordml/symex" xmlns:wpg="http://schemas.microsoft.com/office/word/2010/wordprocessingGroup" xmlns:wpi="http://schemas.microsoft.com/office/word/2010/wordprocessingInk" xmlns:wne="http://schemas.microsoft.com/office/word/2006/wordml" xmlns:wps="http://schemas.microsoft.com/office/word/2010/wordprocessingShape" mc:Ignorable="w14 w15 w16se w16cid w16 w16cex w16sdtdh w16sdtfl w16du wp14">
   <w:endnote w:type="separator" w:id="-1">
     <w:p>
       <w:r>
@@ -6597,7 +6678,7 @@
 </file>
 
 <file path=word/footer1.xml><?xml version="1.0" encoding="utf-8"?>
-<w:ftr xmlns:wpc="http://schemas.microsoft.com/office/word/2010/wordprocessingCanvas" xmlns:mc="http://schemas.openxmlformats.org/markup-compatibility/2006" xmlns:o="urn:schemas-microsoft-com:office:office" xmlns:r="http://schemas.openxmlformats.org/officeDocument/2006/relationships" xmlns:m="http://schemas.openxmlformats.org/officeDocument/2006/math" xmlns:v="urn:schemas-microsoft-com:vml" xmlns:wp14="http://schemas.microsoft.com/office/word/2010/wordprocessingDrawing" xmlns:wp="http://schemas.openxmlformats.org/drawingml/2006/wordprocessingDrawing" xmlns:w10="urn:schemas-microsoft-com:office:word" xmlns:w="http://schemas.openxmlformats.org/wordprocessingml/2006/main" xmlns:w14="http://schemas.microsoft.com/office/word/2010/wordml" xmlns:w15="http://schemas.microsoft.com/office/word/2012/wordml" xmlns:wpg="http://schemas.microsoft.com/office/word/2010/wordprocessingGroup" xmlns:wpi="http://schemas.microsoft.com/office/word/2010/wordprocessingInk" xmlns:wne="http://schemas.microsoft.com/office/word/2006/wordml" xmlns:wps="http://schemas.microsoft.com/office/word/2010/wordprocessingShape" mc:Ignorable="w14 w15 wp14">
+<w:ftr xmlns:wpc="http://schemas.microsoft.com/office/word/2010/wordprocessingCanvas" xmlns:cx="http://schemas.microsoft.com/office/drawing/2014/chartex" xmlns:cx1="http://schemas.microsoft.com/office/drawing/2015/9/8/chartex" xmlns:cx2="http://schemas.microsoft.com/office/drawing/2015/10/21/chartex" xmlns:cx3="http://schemas.microsoft.com/office/drawing/2016/5/9/chartex" xmlns:cx4="http://schemas.microsoft.com/office/drawing/2016/5/10/chartex" xmlns:cx5="http://schemas.microsoft.com/office/drawing/2016/5/11/chartex" xmlns:cx6="http://schemas.microsoft.com/office/drawing/2016/5/12/chartex" xmlns:cx7="http://schemas.microsoft.com/office/drawing/2016/5/13/chartex" xmlns:cx8="http://schemas.microsoft.com/office/drawing/2016/5/14/chartex" xmlns:mc="http://schemas.openxmlformats.org/markup-compatibility/2006" xmlns:aink="http://schemas.microsoft.com/office/drawing/2016/ink" xmlns:am3d="http://schemas.microsoft.com/office/drawing/2017/model3d" xmlns:o="urn:schemas-microsoft-com:office:office" xmlns:oel="http://schemas.microsoft.com/office/2019/extlst" xmlns:r="http://schemas.openxmlformats.org/officeDocument/2006/relationships" xmlns:m="http://schemas.openxmlformats.org/officeDocument/2006/math" xmlns:v="urn:schemas-microsoft-com:vml" xmlns:wp14="http://schemas.microsoft.com/office/word/2010/wordprocessingDrawing" xmlns:wp="http://schemas.openxmlformats.org/drawingml/2006/wordprocessingDrawing" xmlns:w10="urn:schemas-microsoft-com:office:word" xmlns:w="http://schemas.openxmlformats.org/wordprocessingml/2006/main" xmlns:w14="http://schemas.microsoft.com/office/word/2010/wordml" xmlns:w15="http://schemas.microsoft.com/office/word/2012/wordml" xmlns:w16cex="http://schemas.microsoft.com/office/word/2018/wordml/cex" xmlns:w16cid="http://schemas.microsoft.com/office/word/2016/wordml/cid" xmlns:w16="http://schemas.microsoft.com/office/word/2018/wordml" xmlns:w16du="http://schemas.microsoft.com/office/word/2023/wordml/word16du" xmlns:w16sdtdh="http://schemas.microsoft.com/office/word/2020/wordml/sdtdatahash" xmlns:w16sdtfl="http://schemas.microsoft.com/office/word/2024/wordml/sdtformatlock" xmlns:w16se="http://schemas.microsoft.com/office/word/2015/wordml/symex" xmlns:wpg="http://schemas.microsoft.com/office/word/2010/wordprocessingGroup" xmlns:wpi="http://schemas.microsoft.com/office/word/2010/wordprocessingInk" xmlns:wne="http://schemas.microsoft.com/office/word/2006/wordml" xmlns:wps="http://schemas.microsoft.com/office/word/2010/wordprocessingShape" mc:Ignorable="w14 w15 w16se w16cid w16 w16cex w16sdtdh w16sdtfl w16du wp14">
   <w:p>
     <w:pPr>
       <w:pStyle w:val="Textoindependiente"/>
@@ -6702,8 +6783,7 @@
               <v:stroke joinstyle="miter"/>
               <v:path gradientshapeok="t" o:connecttype="rect"/>
             </v:shapetype>
-            <v:shape id="Textbox 3" o:spid="_x0000_s1027" type="#_x0000_t202" style="position:absolute;margin-left:501.2pt;margin-top:780.5pt;width:13.15pt;height:14.35pt;z-index:-15872000;visibility:visible;mso-wrap-style:square;mso-wrap-distance-left:0;mso-wrap-distance-top:0;mso-wrap-distance-right:0;mso-wrap-distance-bottom:0;mso-position-horizontal:absolute;mso-position-horizontal-relative:page;mso-position-vertical:absolute;mso-position-vertical-relative:page;v-text-anchor:top" o:gfxdata="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" filled="f" stroked="f">
-              <v:path arrowok="t"/>
+            <v:shape id="Textbox 3" o:spid="_x0000_s1027" type="#_x0000_t202" style="position:absolute;margin-left:501.2pt;margin-top:780.5pt;width:13.15pt;height:14.35pt;z-index:-15872000;visibility:visible;mso-wrap-style:square;mso-wrap-distance-left:0;mso-wrap-distance-top:0;mso-wrap-distance-right:0;mso-wrap-distance-bottom:0;mso-position-horizontal:absolute;mso-position-horizontal-relative:page;mso-position-vertical:absolute;mso-position-vertical-relative:page;v-text-anchor:top" o:gfxdata="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" filled="f" stroked="f">
               <v:textbox inset="0,0,0,0">
                 <w:txbxContent>
                   <w:p>
@@ -6757,7 +6837,7 @@
 </file>
 
 <file path=word/footnotes.xml><?xml version="1.0" encoding="utf-8"?>
-<w:footnotes xmlns:wpc="http://schemas.microsoft.com/office/word/2010/wordprocessingCanvas" xmlns:mc="http://schemas.openxmlformats.org/markup-compatibility/2006" xmlns:o="urn:schemas-microsoft-com:office:office" xmlns:r="http://schemas.openxmlformats.org/officeDocument/2006/relationships" xmlns:m="http://schemas.openxmlformats.org/officeDocument/2006/math" xmlns:v="urn:schemas-microsoft-com:vml" xmlns:wp14="http://schemas.microsoft.com/office/word/2010/wordprocessingDrawing" xmlns:wp="http://schemas.openxmlformats.org/drawingml/2006/wordprocessingDrawing" xmlns:w10="urn:schemas-microsoft-com:office:word" xmlns:w="http://schemas.openxmlformats.org/wordprocessingml/2006/main" xmlns:w14="http://schemas.microsoft.com/office/word/2010/wordml" xmlns:w15="http://schemas.microsoft.com/office/word/2012/wordml" xmlns:wpg="http://schemas.microsoft.com/office/word/2010/wordprocessingGroup" xmlns:wpi="http://schemas.microsoft.com/office/word/2010/wordprocessingInk" xmlns:wne="http://schemas.microsoft.com/office/word/2006/wordml" xmlns:wps="http://schemas.microsoft.com/office/word/2010/wordprocessingShape" mc:Ignorable="w14 w15 wp14">
+<w:footnotes xmlns:wpc="http://schemas.microsoft.com/office/word/2010/wordprocessingCanvas" xmlns:cx="http://schemas.microsoft.com/office/drawing/2014/chartex" xmlns:cx1="http://schemas.microsoft.com/office/drawing/2015/9/8/chartex" xmlns:cx2="http://schemas.microsoft.com/office/drawing/2015/10/21/chartex" xmlns:cx3="http://schemas.microsoft.com/office/drawing/2016/5/9/chartex" xmlns:cx4="http://schemas.microsoft.com/office/drawing/2016/5/10/chartex" xmlns:cx5="http://schemas.microsoft.com/office/drawing/2016/5/11/chartex" xmlns:cx6="http://schemas.microsoft.com/office/drawing/2016/5/12/chartex" xmlns:cx7="http://schemas.microsoft.com/office/drawing/2016/5/13/chartex" xmlns:cx8="http://schemas.microsoft.com/office/drawing/2016/5/14/chartex" xmlns:mc="http://schemas.openxmlformats.org/markup-compatibility/2006" xmlns:aink="http://schemas.microsoft.com/office/drawing/2016/ink" xmlns:am3d="http://schemas.microsoft.com/office/drawing/2017/model3d" xmlns:o="urn:schemas-microsoft-com:office:office" xmlns:oel="http://schemas.microsoft.com/office/2019/extlst" xmlns:r="http://schemas.openxmlformats.org/officeDocument/2006/relationships" xmlns:m="http://schemas.openxmlformats.org/officeDocument/2006/math" xmlns:v="urn:schemas-microsoft-com:vml" xmlns:wp14="http://schemas.microsoft.com/office/word/2010/wordprocessingDrawing" xmlns:wp="http://schemas.openxmlformats.org/drawingml/2006/wordprocessingDrawing" xmlns:w10="urn:schemas-microsoft-com:office:word" xmlns:w="http://schemas.openxmlformats.org/wordprocessingml/2006/main" xmlns:w14="http://schemas.microsoft.com/office/word/2010/wordml" xmlns:w15="http://schemas.microsoft.com/office/word/2012/wordml" xmlns:w16cex="http://schemas.microsoft.com/office/word/2018/wordml/cex" xmlns:w16cid="http://schemas.microsoft.com/office/word/2016/wordml/cid" xmlns:w16="http://schemas.microsoft.com/office/word/2018/wordml" xmlns:w16du="http://schemas.microsoft.com/office/word/2023/wordml/word16du" xmlns:w16sdtdh="http://schemas.microsoft.com/office/word/2020/wordml/sdtdatahash" xmlns:w16sdtfl="http://schemas.microsoft.com/office/word/2024/wordml/sdtformatlock" xmlns:w16se="http://schemas.microsoft.com/office/word/2015/wordml/symex" xmlns:wpg="http://schemas.microsoft.com/office/word/2010/wordprocessingGroup" xmlns:wpi="http://schemas.microsoft.com/office/word/2010/wordprocessingInk" xmlns:wne="http://schemas.microsoft.com/office/word/2006/wordml" xmlns:wps="http://schemas.microsoft.com/office/word/2010/wordprocessingShape" mc:Ignorable="w14 w15 w16se w16cid w16 w16cex w16sdtdh w16sdtfl w16du wp14">
   <w:footnote w:type="separator" w:id="-1">
     <w:p>
       <w:r>
@@ -6776,7 +6856,7 @@
 </file>
 
 <file path=word/header1.xml><?xml version="1.0" encoding="utf-8"?>
-<w:hdr xmlns:wpc="http://schemas.microsoft.com/office/word/2010/wordprocessingCanvas" xmlns:mc="http://schemas.openxmlformats.org/markup-compatibility/2006" xmlns:o="urn:schemas-microsoft-com:office:office" xmlns:r="http://schemas.openxmlformats.org/officeDocument/2006/relationships" xmlns:m="http://schemas.openxmlformats.org/officeDocument/2006/math" xmlns:v="urn:schemas-microsoft-com:vml" xmlns:wp14="http://schemas.microsoft.com/office/word/2010/wordprocessingDrawing" xmlns:wp="http://schemas.openxmlformats.org/drawingml/2006/wordprocessingDrawing" xmlns:w10="urn:schemas-microsoft-com:office:word" xmlns:w="http://schemas.openxmlformats.org/wordprocessingml/2006/main" xmlns:w14="http://schemas.microsoft.com/office/word/2010/wordml" xmlns:w15="http://schemas.microsoft.com/office/word/2012/wordml" xmlns:wpg="http://schemas.microsoft.com/office/word/2010/wordprocessingGroup" xmlns:wpi="http://schemas.microsoft.com/office/word/2010/wordprocessingInk" xmlns:wne="http://schemas.microsoft.com/office/word/2006/wordml" xmlns:wps="http://schemas.microsoft.com/office/word/2010/wordprocessingShape" mc:Ignorable="w14 w15 wp14">
+<w:hdr xmlns:wpc="http://schemas.microsoft.com/office/word/2010/wordprocessingCanvas" xmlns:cx="http://schemas.microsoft.com/office/drawing/2014/chartex" xmlns:cx1="http://schemas.microsoft.com/office/drawing/2015/9/8/chartex" xmlns:cx2="http://schemas.microsoft.com/office/drawing/2015/10/21/chartex" xmlns:cx3="http://schemas.microsoft.com/office/drawing/2016/5/9/chartex" xmlns:cx4="http://schemas.microsoft.com/office/drawing/2016/5/10/chartex" xmlns:cx5="http://schemas.microsoft.com/office/drawing/2016/5/11/chartex" xmlns:cx6="http://schemas.microsoft.com/office/drawing/2016/5/12/chartex" xmlns:cx7="http://schemas.microsoft.com/office/drawing/2016/5/13/chartex" xmlns:cx8="http://schemas.microsoft.com/office/drawing/2016/5/14/chartex" xmlns:mc="http://schemas.openxmlformats.org/markup-compatibility/2006" xmlns:aink="http://schemas.microsoft.com/office/drawing/2016/ink" xmlns:am3d="http://schemas.microsoft.com/office/drawing/2017/model3d" xmlns:o="urn:schemas-microsoft-com:office:office" xmlns:oel="http://schemas.microsoft.com/office/2019/extlst" xmlns:r="http://schemas.openxmlformats.org/officeDocument/2006/relationships" xmlns:m="http://schemas.openxmlformats.org/officeDocument/2006/math" xmlns:v="urn:schemas-microsoft-com:vml" xmlns:wp14="http://schemas.microsoft.com/office/word/2010/wordprocessingDrawing" xmlns:wp="http://schemas.openxmlformats.org/drawingml/2006/wordprocessingDrawing" xmlns:w10="urn:schemas-microsoft-com:office:word" xmlns:w="http://schemas.openxmlformats.org/wordprocessingml/2006/main" xmlns:w14="http://schemas.microsoft.com/office/word/2010/wordml" xmlns:w15="http://schemas.microsoft.com/office/word/2012/wordml" xmlns:w16cex="http://schemas.microsoft.com/office/word/2018/wordml/cex" xmlns:w16cid="http://schemas.microsoft.com/office/word/2016/wordml/cid" xmlns:w16="http://schemas.microsoft.com/office/word/2018/wordml" xmlns:w16du="http://schemas.microsoft.com/office/word/2023/wordml/word16du" xmlns:w16sdtdh="http://schemas.microsoft.com/office/word/2020/wordml/sdtdatahash" xmlns:w16sdtfl="http://schemas.microsoft.com/office/word/2024/wordml/sdtformatlock" xmlns:w16se="http://schemas.microsoft.com/office/word/2015/wordml/symex" xmlns:wpg="http://schemas.microsoft.com/office/word/2010/wordprocessingGroup" xmlns:wpi="http://schemas.microsoft.com/office/word/2010/wordprocessingInk" xmlns:wne="http://schemas.microsoft.com/office/word/2006/wordml" xmlns:wps="http://schemas.microsoft.com/office/word/2010/wordprocessingShape" mc:Ignorable="w14 w15 w16se w16cid w16 w16cex w16sdtdh w16sdtfl w16du wp14">
   <w:p>
     <w:pPr>
       <w:pStyle w:val="Textoindependiente"/>
@@ -6928,8 +7008,7 @@
               <v:stroke joinstyle="miter"/>
               <v:path gradientshapeok="t" o:connecttype="rect"/>
             </v:shapetype>
-            <v:shape id="Textbox 2" o:spid="_x0000_s1026" type="#_x0000_t202" style="position:absolute;margin-left:84.1pt;margin-top:34.6pt;width:267.25pt;height:14.35pt;z-index:-15872512;visibility:visible;mso-wrap-style:square;mso-wrap-distance-left:0;mso-wrap-distance-top:0;mso-wrap-distance-right:0;mso-wrap-distance-bottom:0;mso-position-horizontal:absolute;mso-position-horizontal-relative:page;mso-position-vertical:absolute;mso-position-vertical-relative:page;v-text-anchor:top" o:gfxdata="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" filled="f" stroked="f">
-              <v:path arrowok="t"/>
+            <v:shape id="Textbox 2" o:spid="_x0000_s1026" type="#_x0000_t202" style="position:absolute;margin-left:84.1pt;margin-top:34.6pt;width:267.25pt;height:14.35pt;z-index:-15872512;visibility:visible;mso-wrap-style:square;mso-wrap-distance-left:0;mso-wrap-distance-top:0;mso-wrap-distance-right:0;mso-wrap-distance-bottom:0;mso-position-horizontal:absolute;mso-position-horizontal-relative:page;mso-position-vertical:absolute;mso-position-vertical-relative:page;v-text-anchor:top" o:gfxdata="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" filled="f" stroked="f">
               <v:textbox inset="0,0,0,0">
                 <w:txbxContent>
                   <w:p>
@@ -7030,7 +7109,7 @@
 </file>
 
 <file path=word/styles.xml><?xml version="1.0" encoding="utf-8"?>
-<w:styles xmlns:mc="http://schemas.openxmlformats.org/markup-compatibility/2006" xmlns:r="http://schemas.openxmlformats.org/officeDocument/2006/relationships" xmlns:w="http://schemas.openxmlformats.org/wordprocessingml/2006/main" xmlns:w14="http://schemas.microsoft.com/office/word/2010/wordml" xmlns:w15="http://schemas.microsoft.com/office/word/2012/wordml" mc:Ignorable="w14 w15">
+<w:styles xmlns:mc="http://schemas.openxmlformats.org/markup-compatibility/2006" xmlns:r="http://schemas.openxmlformats.org/officeDocument/2006/relationships" xmlns:w="http://schemas.openxmlformats.org/wordprocessingml/2006/main" xmlns:w14="http://schemas.microsoft.com/office/word/2010/wordml" xmlns:w15="http://schemas.microsoft.com/office/word/2012/wordml" xmlns:w16cex="http://schemas.microsoft.com/office/word/2018/wordml/cex" xmlns:w16cid="http://schemas.microsoft.com/office/word/2016/wordml/cid" xmlns:w16="http://schemas.microsoft.com/office/word/2018/wordml" xmlns:w16du="http://schemas.microsoft.com/office/word/2023/wordml/word16du" xmlns:w16sdtdh="http://schemas.microsoft.com/office/word/2020/wordml/sdtdatahash" xmlns:w16sdtfl="http://schemas.microsoft.com/office/word/2024/wordml/sdtformatlock" xmlns:w16se="http://schemas.microsoft.com/office/word/2015/wordml/symex" mc:Ignorable="w14 w15 w16se w16cid w16 w16cex w16sdtdh w16sdtfl w16du">
   <w:docDefaults>
     <w:rPrDefault>
       <w:rPr>
@@ -7048,7 +7127,7 @@
       </w:pPr>
     </w:pPrDefault>
   </w:docDefaults>
-  <w:latentStyles w:defLockedState="0" w:defUIPriority="99" w:defSemiHidden="0" w:defUnhideWhenUsed="0" w:defQFormat="0" w:count="371">
+  <w:latentStyles w:defLockedState="0" w:defUIPriority="99" w:defSemiHidden="0" w:defUnhideWhenUsed="0" w:defQFormat="0" w:count="376">
     <w:lsdException w:name="Normal" w:uiPriority="0" w:qFormat="1"/>
     <w:lsdException w:name="heading 1" w:uiPriority="9" w:qFormat="1"/>
     <w:lsdException w:name="heading 2" w:semiHidden="1" w:uiPriority="9" w:unhideWhenUsed="1" w:qFormat="1"/>
@@ -7420,11 +7499,16 @@
     <w:lsdException w:name="List Table 5 Dark Accent 6" w:uiPriority="50"/>
     <w:lsdException w:name="List Table 6 Colorful Accent 6" w:uiPriority="51"/>
     <w:lsdException w:name="List Table 7 Colorful Accent 6" w:uiPriority="52"/>
+    <w:lsdException w:name="Mention" w:semiHidden="1" w:unhideWhenUsed="1"/>
+    <w:lsdException w:name="Smart Hyperlink" w:semiHidden="1" w:unhideWhenUsed="1"/>
+    <w:lsdException w:name="Hashtag" w:semiHidden="1" w:unhideWhenUsed="1"/>
+    <w:lsdException w:name="Unresolved Mention" w:semiHidden="1" w:unhideWhenUsed="1"/>
+    <w:lsdException w:name="Smart Link" w:semiHidden="1" w:unhideWhenUsed="1"/>
   </w:latentStyles>
   <w:style w:type="paragraph" w:default="1" w:styleId="Normal">
     <w:name w:val="Normal"/>
     <w:qFormat/>
-    <w:rsid w:val="006245BF"/>
+    <w:rsid w:val="00D17BCE"/>
     <w:rPr>
       <w:rFonts w:ascii="Arial MT" w:eastAsia="Arial MT" w:hAnsi="Arial MT" w:cs="Arial MT"/>
       <w:lang w:val="es-ES"/>
@@ -7479,7 +7563,7 @@
     <w:uiPriority w:val="1"/>
     <w:qFormat/>
   </w:style>
-  <w:style w:type="paragraph" w:styleId="Puesto">
+  <w:style w:type="paragraph" w:styleId="Ttulo">
     <w:name w:val="Title"/>
     <w:basedOn w:val="Normal"/>
     <w:uiPriority w:val="10"/>

</xml_diff>